<commit_message>
docs(oauth): Google Workspace channel - user guide v1.6 + design docs (01.12)
Documentation catch-up for the shipped Google Workspace OAuth import channel. USER_GUIDE.md bumped to v1.6 with the Google Workspace export method; regenerated handout .docx and the in-app PDF (frontend/public/TRAIGA_Auditor_User_Guide.pdf) in the SAME commit so the app never serves a stale guide. DISCOVERY_EXPANSION_DESIGN.md now records the shipped export-based acquisition (Admin console Accessed-apps CSV parsed by engine/collectors/google_oauth.py) instead of the future tokens.list API. INVENTORY_SPEC.md moves discovered_oauth out of future. Release stamped so the log matches what shipped. The dialog tab-isolation fix shipped separately in 027d480.

Release: 01.12

Ship-Bat: ship_oauth_google_docs.bat
</commit_message>
<xml_diff>
--- a/TRAIGA_Auditor_User_Guide_v1.docx
+++ b/TRAIGA_Auditor_User_Guide_v1.docx
@@ -93,7 +93,7 @@
         <w:t xml:space="preserve"> </w:t>
       </w:r>
       <w:r>
-        <w:t xml:space="preserve">1.2</w:t>
+        <w:t xml:space="preserve">1.6</w:t>
       </w:r>
     </w:p>
     <w:p>
@@ -101,13 +101,13 @@
         <w:pStyle w:val="Date"/>
       </w:pPr>
       <w:r>
-        <w:t xml:space="preserve">July</w:t>
-      </w:r>
-      <w:r>
-        <w:t xml:space="preserve"> </w:t>
-      </w:r>
-      <w:r>
-        <w:t xml:space="preserve">18,</w:t>
+        <w:t xml:space="preserve">August</w:t>
+      </w:r>
+      <w:r>
+        <w:t xml:space="preserve"> </w:t>
+      </w:r>
+      <w:r>
+        <w:t xml:space="preserve">21,</w:t>
       </w:r>
       <w:r>
         <w:t xml:space="preserve"> </w:t>
@@ -1981,7 +1981,7 @@
         <w:rPr>
           <w:b/>
         </w:rPr>
-        <w:t xml:space="preserve">Import Procurement / Sync Staff Usage / Agendas</w:t>
+        <w:t xml:space="preserve">Import Procurement / Sync Staff Usage / Agendas / OAuth</w:t>
       </w:r>
       <w:r>
         <w:t xml:space="preserve"> </w:t>
@@ -2494,11 +2494,11 @@
     </w:p>
     <w:p>
       <w:pPr>
-        <w:pStyle w:val="Heading1"/>
-      </w:pPr>
-      <w:bookmarkStart w:id="37" w:name="safe-harbor-readiness-framework-lenses"/>
-      <w:r>
-        <w:t xml:space="preserve">Safe Harbor Readiness &amp; Framework Lenses</w:t>
+        <w:pStyle w:val="Heading2"/>
+      </w:pPr>
+      <w:bookmarkStart w:id="37" w:name="Xc4ed773a6e1f6d8a6d7ac0e65bd377ed356aa7f"/>
+      <w:r>
+        <w:t xml:space="preserve">Discovering shadow AI your staff signed up for (OAuth)</w:t>
       </w:r>
       <w:bookmarkEnd w:id="37"/>
     </w:p>
@@ -2507,108 +2507,108 @@
         <w:pStyle w:val="FirstParagraph"/>
       </w:pPr>
       <w:r>
-        <w:t xml:space="preserve">At the bottom of each city page,</w:t>
-      </w:r>
-      <w:r>
-        <w:t xml:space="preserve"> </w:t>
-      </w:r>
-      <w:r>
-        <w:rPr>
-          <w:b/>
-        </w:rPr>
-        <w:t xml:space="preserve">TRAIGA Safe Harbor Readiness</w:t>
-      </w:r>
-      <w:r>
-        <w:t xml:space="preserve"> </w:t>
-      </w:r>
-      <w:r>
-        <w:t xml:space="preserve">scores the city’s AI governance against the</w:t>
-      </w:r>
-      <w:r>
-        <w:t xml:space="preserve"> </w:t>
-      </w:r>
-      <w:r>
-        <w:rPr>
-          <w:b/>
-        </w:rPr>
-        <w:t xml:space="preserve">Municipal AI Profile</w:t>
-      </w:r>
-      <w:r>
-        <w:t xml:space="preserve"> </w:t>
-      </w:r>
-      <w:r>
-        <w:t xml:space="preserve">— a right-sized profile of the</w:t>
-      </w:r>
-      <w:r>
-        <w:t xml:space="preserve"> </w:t>
-      </w:r>
-      <w:r>
-        <w:rPr>
-          <w:b/>
-        </w:rPr>
-        <w:t xml:space="preserve">NIST AI Risk Management Framework</w:t>
-      </w:r>
-      <w:r>
-        <w:t xml:space="preserve"> </w:t>
-      </w:r>
-      <w:r>
-        <w:t xml:space="preserve">and its Generative AI Profile. This supports the reasonable-care presumption and internal-review defenses under</w:t>
-      </w:r>
-      <w:r>
-        <w:t xml:space="preserve"> </w:t>
-      </w:r>
-      <w:r>
-        <w:rPr>
-          <w:b/>
-        </w:rPr>
-        <w:t xml:space="preserve">Tex. Bus. &amp; Com. Code § 552.105(c)–(e)</w:t>
-      </w:r>
-      <w:r>
-        <w:t xml:space="preserve">.</w:t>
-      </w:r>
-    </w:p>
-    <w:p>
-      <w:pPr>
-        <w:pStyle w:val="Heading2"/>
-      </w:pPr>
-      <w:bookmarkStart w:id="38" w:name="the-four-functions"/>
-      <w:r>
-        <w:t xml:space="preserve">The four functions</w:t>
-      </w:r>
-      <w:bookmarkEnd w:id="38"/>
-    </w:p>
-    <w:p>
-      <w:pPr>
-        <w:pStyle w:val="FirstParagraph"/>
-      </w:pPr>
-      <w:r>
-        <w:t xml:space="preserve">Controls are grouped into the NIST functions —</w:t>
-      </w:r>
-      <w:r>
-        <w:t xml:space="preserve"> </w:t>
-      </w:r>
-      <w:r>
-        <w:rPr>
-          <w:b/>
-        </w:rPr>
-        <w:t xml:space="preserve">GOVERN, MAP, MEASURE, MANAGE</w:t>
-      </w:r>
-      <w:r>
-        <w:t xml:space="preserve"> </w:t>
-      </w:r>
-      <w:r>
-        <w:t xml:space="preserve">— each shown as a ring with a satisfied/total count.</w:t>
-      </w:r>
-    </w:p>
-    <w:p>
-      <w:pPr>
-        <w:pStyle w:val="Heading2"/>
-      </w:pPr>
-      <w:bookmarkStart w:id="39" w:name="machine-verified-vs.-attested-controls"/>
-      <w:r>
-        <w:t xml:space="preserve">Machine-verified vs. attested controls</w:t>
-      </w:r>
-      <w:bookmarkEnd w:id="39"/>
+        <w:t xml:space="preserve">Most of the AI in a city is not on the website and never went through procurement — it is a</w:t>
+      </w:r>
+      <w:r>
+        <w:t xml:space="preserve"> </w:t>
+      </w:r>
+      <w:r>
+        <w:t xml:space="preserve">free tool an employee signed into with their work account. The</w:t>
+      </w:r>
+      <w:r>
+        <w:t xml:space="preserve"> </w:t>
+      </w:r>
+      <w:r>
+        <w:rPr>
+          <w:b/>
+        </w:rPr>
+        <w:t xml:space="preserve">OAuth</w:t>
+      </w:r>
+      <w:r>
+        <w:t xml:space="preserve"> </w:t>
+      </w:r>
+      <w:r>
+        <w:t xml:space="preserve">tool finds it.</w:t>
+      </w:r>
+    </w:p>
+    <w:p>
+      <w:pPr>
+        <w:pStyle w:val="BodyText"/>
+      </w:pPr>
+      <w:r>
+        <w:rPr>
+          <w:b/>
+        </w:rPr>
+        <w:t xml:space="preserve">Nothing is connected to your tenant, and we are given no access.</w:t>
+      </w:r>
+      <w:r>
+        <w:t xml:space="preserve"> </w:t>
+      </w:r>
+      <w:r>
+        <w:t xml:space="preserve">There is no app</w:t>
+      </w:r>
+      <w:r>
+        <w:t xml:space="preserve"> </w:t>
+      </w:r>
+      <w:r>
+        <w:t xml:space="preserve">registration, no client secret and no standing permission — so there is nothing for you to</w:t>
+      </w:r>
+      <w:r>
+        <w:t xml:space="preserve"> </w:t>
+      </w:r>
+      <w:r>
+        <w:t xml:space="preserve">revoke afterwards.</w:t>
+      </w:r>
+    </w:p>
+    <w:p>
+      <w:pPr>
+        <w:pStyle w:val="BodyText"/>
+      </w:pPr>
+      <w:r>
+        <w:t xml:space="preserve">The dialog walks your administrator through it step by step, with every command ready to</w:t>
+      </w:r>
+      <w:r>
+        <w:t xml:space="preserve"> </w:t>
+      </w:r>
+      <w:r>
+        <w:t xml:space="preserve">copy. Pick your identity provider at the top —</w:t>
+      </w:r>
+      <w:r>
+        <w:t xml:space="preserve"> </w:t>
+      </w:r>
+      <w:r>
+        <w:rPr>
+          <w:b/>
+        </w:rPr>
+        <w:t xml:space="preserve">Microsoft 365</w:t>
+      </w:r>
+      <w:r>
+        <w:t xml:space="preserve"> </w:t>
+      </w:r>
+      <w:r>
+        <w:t xml:space="preserve">or</w:t>
+      </w:r>
+      <w:r>
+        <w:t xml:space="preserve"> </w:t>
+      </w:r>
+      <w:r>
+        <w:rPr>
+          <w:b/>
+        </w:rPr>
+        <w:t xml:space="preserve">Google Workspace</w:t>
+      </w:r>
+      <w:r>
+        <w:t xml:space="preserve"> </w:t>
+      </w:r>
+      <w:r>
+        <w:t xml:space="preserve">—</w:t>
+      </w:r>
+      <w:r>
+        <w:t xml:space="preserve"> </w:t>
+      </w:r>
+      <w:r>
+        <w:t xml:space="preserve">and follow the steps for it. All paths produce the same result:</w:t>
+      </w:r>
     </w:p>
     <w:p>
       <w:pPr>
@@ -2622,67 +2622,25 @@
         <w:rPr>
           <w:b/>
         </w:rPr>
-        <w:t xml:space="preserve">Machine-verified</w:t>
-      </w:r>
-      <w:r>
-        <w:t xml:space="preserve"> </w:t>
-      </w:r>
-      <w:r>
-        <w:t xml:space="preserve">controls are satisfied automatically from platform data (for example,</w:t>
-      </w:r>
-      <w:r>
-        <w:t xml:space="preserve"> </w:t>
-      </w:r>
-      <w:r>
-        <w:t xml:space="preserve">“</w:t>
-      </w:r>
-      <w:r>
-        <w:t xml:space="preserve">public-facing AI is actively discovered</w:t>
-      </w:r>
-      <w:r>
-        <w:t xml:space="preserve">”</w:t>
-      </w:r>
-      <w:r>
-        <w:t xml:space="preserve"> </w:t>
-      </w:r>
-      <w:r>
-        <w:t xml:space="preserve">is proven by the scanner;</w:t>
-      </w:r>
-      <w:r>
-        <w:t xml:space="preserve"> </w:t>
-      </w:r>
-      <w:r>
-        <w:t xml:space="preserve">“</w:t>
-      </w:r>
-      <w:r>
-        <w:t xml:space="preserve">findings are tracked with cure deadlines</w:t>
-      </w:r>
-      <w:r>
-        <w:t xml:space="preserve">”</w:t>
-      </w:r>
-      <w:r>
-        <w:t xml:space="preserve"> </w:t>
-      </w:r>
-      <w:r>
-        <w:t xml:space="preserve">by the cure clock). These show a</w:t>
-      </w:r>
-      <w:r>
-        <w:t xml:space="preserve"> </w:t>
-      </w:r>
-      <w:r>
-        <w:t xml:space="preserve">“</w:t>
-      </w:r>
-      <w:r>
-        <w:t xml:space="preserve">Machine-verified from platform data</w:t>
-      </w:r>
-      <w:r>
-        <w:t xml:space="preserve">”</w:t>
-      </w:r>
-      <w:r>
-        <w:t xml:space="preserve"> </w:t>
-      </w:r>
-      <w:r>
-        <w:t xml:space="preserve">note.</w:t>
+        <w:t xml:space="preserve">Run the script.</w:t>
+      </w:r>
+      <w:r>
+        <w:t xml:space="preserve"> </w:t>
+      </w:r>
+      <w:r>
+        <w:t xml:space="preserve">A small read-only export script, downloaded from the dashboard so it</w:t>
+      </w:r>
+      <w:r>
+        <w:t xml:space="preserve"> </w:t>
+      </w:r>
+      <w:r>
+        <w:t xml:space="preserve">always matches the running system, executed on the administrator’s own machine while</w:t>
+      </w:r>
+      <w:r>
+        <w:t xml:space="preserve"> </w:t>
+      </w:r>
+      <w:r>
+        <w:t xml:space="preserve">signed in as themselves. The checksum is shown next to the download.</w:t>
       </w:r>
     </w:p>
     <w:p>
@@ -2697,195 +2655,224 @@
         <w:rPr>
           <w:b/>
         </w:rPr>
-        <w:t xml:space="preserve">Attested</w:t>
-      </w:r>
-      <w:r>
-        <w:t xml:space="preserve"> </w:t>
-      </w:r>
-      <w:r>
-        <w:t xml:space="preserve">controls are things the platform cannot observe (for example,</w:t>
-      </w:r>
-      <w:r>
-        <w:t xml:space="preserve"> </w:t>
-      </w:r>
-      <w:r>
-        <w:t xml:space="preserve">“</w:t>
-      </w:r>
-      <w:r>
-        <w:t xml:space="preserve">an AI use policy is adopted</w:t>
-      </w:r>
-      <w:r>
-        <w:t xml:space="preserve">”</w:t>
-      </w:r>
-      <w:r>
-        <w:t xml:space="preserve">). An admin marks these satisfied with the</w:t>
-      </w:r>
-      <w:r>
-        <w:t xml:space="preserve"> </w:t>
-      </w:r>
-      <w:r>
-        <w:rPr>
-          <w:b/>
-        </w:rPr>
-        <w:t xml:space="preserve">Attest</w:t>
-      </w:r>
-      <w:r>
-        <w:t xml:space="preserve"> </w:t>
-      </w:r>
-      <w:r>
-        <w:t xml:space="preserve">button, adding evidence notes and a timestamp that appear in generated documentation. Use</w:t>
-      </w:r>
-      <w:r>
-        <w:t xml:space="preserve"> </w:t>
-      </w:r>
-      <w:r>
-        <w:rPr>
-          <w:b/>
-        </w:rPr>
-        <w:t xml:space="preserve">Clear</w:t>
-      </w:r>
-      <w:r>
-        <w:t xml:space="preserve"> </w:t>
-      </w:r>
-      <w:r>
-        <w:t xml:space="preserve">to remove an attestation.</w:t>
-      </w:r>
-    </w:p>
-    <w:p>
-      <w:pPr>
-        <w:pStyle w:val="Heading2"/>
-      </w:pPr>
-      <w:bookmarkStart w:id="40" w:name="framework-lenses-nist-iso-42001"/>
-      <w:r>
-        <w:t xml:space="preserve">Framework lenses (NIST / ISO 42001)</w:t>
-      </w:r>
-      <w:bookmarkEnd w:id="40"/>
+        <w:t xml:space="preserve">Browser only (Microsoft 365).</w:t>
+      </w:r>
+      <w:r>
+        <w:t xml:space="preserve"> </w:t>
+      </w:r>
+      <w:r>
+        <w:t xml:space="preserve">Two read-only queries in</w:t>
+      </w:r>
+      <w:r>
+        <w:t xml:space="preserve"> </w:t>
+      </w:r>
+      <w:r>
+        <w:rPr>
+          <w:b/>
+        </w:rPr>
+        <w:t xml:space="preserve">Microsoft Graph Explorer</w:t>
+      </w:r>
+      <w:r>
+        <w:t xml:space="preserve"> </w:t>
+      </w:r>
+      <w:r>
+        <w:t xml:space="preserve">—</w:t>
+      </w:r>
+      <w:r>
+        <w:t xml:space="preserve"> </w:t>
+      </w:r>
+      <w:r>
+        <w:t xml:space="preserve">Microsoft’s own website — and the results downloaded as JSON.</w:t>
+      </w:r>
+      <w:r>
+        <w:t xml:space="preserve"> </w:t>
+      </w:r>
+      <w:r>
+        <w:rPr>
+          <w:b/>
+        </w:rPr>
+        <w:t xml:space="preserve">Nothing installs and</w:t>
+      </w:r>
+      <w:r>
+        <w:rPr>
+          <w:b/>
+        </w:rPr>
+        <w:t xml:space="preserve"> </w:t>
+      </w:r>
+      <w:r>
+        <w:rPr>
+          <w:b/>
+        </w:rPr>
+        <w:t xml:space="preserve">nothing runs on any machine.</w:t>
+      </w:r>
+      <w:r>
+        <w:t xml:space="preserve"> </w:t>
+      </w:r>
+      <w:r>
+        <w:t xml:space="preserve">This is the path for organisations whose endpoint</w:t>
+      </w:r>
+      <w:r>
+        <w:t xml:space="preserve"> </w:t>
+      </w:r>
+      <w:r>
+        <w:t xml:space="preserve">protection, AppLocker or WDAC blocks PowerShell.</w:t>
+      </w:r>
+    </w:p>
+    <w:p>
+      <w:pPr>
+        <w:numPr>
+          <w:ilvl w:val="0"/>
+          <w:numId w:val="1009"/>
+        </w:numPr>
+        <w:pStyle w:val="Compact"/>
+      </w:pPr>
+      <w:r>
+        <w:rPr>
+          <w:b/>
+        </w:rPr>
+        <w:t xml:space="preserve">Google Workspace.</w:t>
+      </w:r>
+      <w:r>
+        <w:t xml:space="preserve"> </w:t>
+      </w:r>
+      <w:r>
+        <w:t xml:space="preserve">No script and nothing to install. A Super Admin opens</w:t>
+      </w:r>
+      <w:r>
+        <w:t xml:space="preserve"> </w:t>
+      </w:r>
+      <w:r>
+        <w:rPr>
+          <w:b/>
+        </w:rPr>
+        <w:t xml:space="preserve">Security →</w:t>
+      </w:r>
+      <w:r>
+        <w:rPr>
+          <w:b/>
+        </w:rPr>
+        <w:t xml:space="preserve"> </w:t>
+      </w:r>
+      <w:r>
+        <w:rPr>
+          <w:b/>
+        </w:rPr>
+        <w:t xml:space="preserve">Access and data control → API controls → App access control</w:t>
+      </w:r>
+      <w:r>
+        <w:t xml:space="preserve">, opens the</w:t>
+      </w:r>
+      <w:r>
+        <w:t xml:space="preserve"> </w:t>
+      </w:r>
+      <w:r>
+        <w:rPr>
+          <w:b/>
+        </w:rPr>
+        <w:t xml:space="preserve">Accessed apps</w:t>
+      </w:r>
+      <w:r>
+        <w:t xml:space="preserve"> </w:t>
+      </w:r>
+      <w:r>
+        <w:t xml:space="preserve">tab, and clicks</w:t>
+      </w:r>
+      <w:r>
+        <w:t xml:space="preserve"> </w:t>
+      </w:r>
+      <w:r>
+        <w:rPr>
+          <w:b/>
+        </w:rPr>
+        <w:t xml:space="preserve">Download list</w:t>
+      </w:r>
+      <w:r>
+        <w:t xml:space="preserve"> </w:t>
+      </w:r>
+      <w:r>
+        <w:t xml:space="preserve">to export a CSV of every app staff have consented to.</w:t>
+      </w:r>
+      <w:r>
+        <w:t xml:space="preserve"> </w:t>
+      </w:r>
+      <w:r>
+        <w:t xml:space="preserve">Upload that single file.</w:t>
+      </w:r>
     </w:p>
     <w:p>
       <w:pPr>
         <w:pStyle w:val="FirstParagraph"/>
       </w:pPr>
       <w:r>
-        <w:t xml:space="preserve">When more than one framework is enabled, a</w:t>
-      </w:r>
-      <w:r>
-        <w:t xml:space="preserve"> </w:t>
-      </w:r>
-      <w:r>
-        <w:rPr>
-          <w:b/>
-        </w:rPr>
-        <w:t xml:space="preserve">Framework lens</w:t>
-      </w:r>
-      <w:r>
-        <w:t xml:space="preserve"> </w:t>
-      </w:r>
-      <w:r>
-        <w:t xml:space="preserve">selector appears. Switching it re-labels each control with the selected framework’s reference (for example, the ISO/IEC 42001 Annex A objective) and shows an</w:t>
-      </w:r>
-      <w:r>
-        <w:t xml:space="preserve"> </w:t>
-      </w:r>
-      <w:r>
-        <w:rPr>
-          <w:b/>
-        </w:rPr>
-        <w:t xml:space="preserve">overlap grade</w:t>
-      </w:r>
-      <w:r>
-        <w:t xml:space="preserve"> </w:t>
-      </w:r>
-      <w:r>
-        <w:t xml:space="preserve">—</w:t>
-      </w:r>
-      <w:r>
-        <w:t xml:space="preserve"> </w:t>
-      </w:r>
-      <w:r>
-        <w:rPr>
-          <w:i/>
-        </w:rPr>
-        <w:t xml:space="preserve">strong</w:t>
-      </w:r>
-      <w:r>
-        <w:t xml:space="preserve">,</w:t>
-      </w:r>
-      <w:r>
-        <w:t xml:space="preserve"> </w:t>
-      </w:r>
-      <w:r>
-        <w:rPr>
-          <w:i/>
-        </w:rPr>
-        <w:t xml:space="preserve">partial</w:t>
-      </w:r>
-      <w:r>
-        <w:t xml:space="preserve">, or</w:t>
-      </w:r>
-      <w:r>
-        <w:t xml:space="preserve"> </w:t>
-      </w:r>
-      <w:r>
-        <w:rPr>
-          <w:i/>
-        </w:rPr>
-        <w:t xml:space="preserve">weak</w:t>
-      </w:r>
-      <w:r>
-        <w:t xml:space="preserve"> </w:t>
-      </w:r>
-      <w:r>
-        <w:t xml:space="preserve">— for how closely the control maps. The underlying assessment does not change; only the labels do. This is how one assessment is reported in several frameworks (</w:t>
-      </w:r>
-      <w:r>
-        <w:t xml:space="preserve">“</w:t>
-      </w:r>
-      <w:r>
-        <w:t xml:space="preserve">assess once, report many</w:t>
-      </w:r>
-      <w:r>
-        <w:t xml:space="preserve">”</w:t>
-      </w:r>
-      <w:r>
-        <w:t xml:space="preserve">). Crosswalk mappings are a positioning aid, not legal advice.</w:t>
-      </w:r>
-    </w:p>
-    <w:p>
-      <w:pPr>
-        <w:pStyle w:val="Heading2"/>
-      </w:pPr>
-      <w:bookmarkStart w:id="41" w:name="alignment-statement"/>
-      <w:r>
-        <w:t xml:space="preserve">Alignment Statement</w:t>
-      </w:r>
-      <w:bookmarkEnd w:id="41"/>
-    </w:p>
-    <w:p>
-      <w:pPr>
-        <w:pStyle w:val="FirstParagraph"/>
-      </w:pPr>
-      <w:r>
-        <w:rPr>
-          <w:b/>
-        </w:rPr>
-        <w:t xml:space="preserve">Alignment Statement</w:t>
-      </w:r>
-      <w:r>
-        <w:t xml:space="preserve"> </w:t>
-      </w:r>
-      <w:r>
-        <w:t xml:space="preserve">generates a Word document summarizing the city’s readiness for the safe-harbor defense. It requires counsel review — the document says so itself.</w:t>
-      </w:r>
-    </w:p>
-    <w:p>
-      <w:pPr>
-        <w:pStyle w:val="Heading1"/>
-      </w:pPr>
-      <w:bookmarkStart w:id="42" w:name="settings"/>
-      <w:r>
-        <w:t xml:space="preserve">Settings</w:t>
-      </w:r>
-      <w:bookmarkEnd w:id="42"/>
+        <w:t xml:space="preserve">We deliberately do not ship a wrapper that bypasses script-execution policy. That is the</w:t>
+      </w:r>
+      <w:r>
+        <w:t xml:space="preserve"> </w:t>
+      </w:r>
+      <w:r>
+        <w:t xml:space="preserve">behaviour security teams block malware for, and we are not going to ask anyone to weaken a</w:t>
+      </w:r>
+      <w:r>
+        <w:t xml:space="preserve"> </w:t>
+      </w:r>
+      <w:r>
+        <w:t xml:space="preserve">control in order to run a compliance tool — hence the browser option.</w:t>
+      </w:r>
+    </w:p>
+    <w:p>
+      <w:pPr>
+        <w:pStyle w:val="BodyText"/>
+      </w:pPr>
+      <w:r>
+        <w:t xml:space="preserve">Either way you end up with JSON to upload.</w:t>
+      </w:r>
+      <w:r>
+        <w:t xml:space="preserve"> </w:t>
+      </w:r>
+      <w:r>
+        <w:rPr>
+          <w:b/>
+        </w:rPr>
+        <w:t xml:space="preserve">Read it before you upload it.</w:t>
+      </w:r>
+      <w:r>
+        <w:t xml:space="preserve"> </w:t>
+      </w:r>
+      <w:r>
+        <w:t xml:space="preserve">Then, in</w:t>
+      </w:r>
+      <w:r>
+        <w:t xml:space="preserve"> </w:t>
+      </w:r>
+      <w:r>
+        <w:rPr>
+          <w:b/>
+        </w:rPr>
+        <w:t xml:space="preserve">AI Inventory → OAuth</w:t>
+      </w:r>
+      <w:r>
+        <w:t xml:space="preserve">, choose your city and provider tab, and select the file — one file</w:t>
+      </w:r>
+      <w:r>
+        <w:t xml:space="preserve"> </w:t>
+      </w:r>
+      <w:r>
+        <w:t xml:space="preserve">for the script or Google Workspace methods, both files for the Microsoft browser method. You</w:t>
+      </w:r>
+      <w:r>
+        <w:t xml:space="preserve"> </w:t>
+      </w:r>
+      <w:r>
+        <w:t xml:space="preserve">will see each application, its publisher, how many staff consented, and what each grant can reach.</w:t>
+      </w:r>
+    </w:p>
+    <w:p>
+      <w:pPr>
+        <w:pStyle w:val="BodyText"/>
+      </w:pPr>
+      <w:r>
+        <w:t xml:space="preserve">Two protections are on by default:</w:t>
+      </w:r>
     </w:p>
     <w:p>
       <w:pPr>
@@ -2899,13 +2886,37 @@
         <w:rPr>
           <w:b/>
         </w:rPr>
-        <w:t xml:space="preserve">Appearance</w:t>
-      </w:r>
-      <w:r>
-        <w:t xml:space="preserve"> </w:t>
-      </w:r>
-      <w:r>
-        <w:t xml:space="preserve">— choose the Light or Stealth interface theme (saved per browser).</w:t>
+        <w:t xml:space="preserve">Dry run.</w:t>
+      </w:r>
+      <w:r>
+        <w:t xml:space="preserve"> </w:t>
+      </w:r>
+      <w:r>
+        <w:t xml:space="preserve">The first run reports what it found and writes</w:t>
+      </w:r>
+      <w:r>
+        <w:t xml:space="preserve"> </w:t>
+      </w:r>
+      <w:r>
+        <w:rPr>
+          <w:b/>
+        </w:rPr>
+        <w:t xml:space="preserve">nothing</w:t>
+      </w:r>
+      <w:r>
+        <w:t xml:space="preserve">. You see the</w:t>
+      </w:r>
+      <w:r>
+        <w:t xml:space="preserve"> </w:t>
+      </w:r>
+      <w:r>
+        <w:t xml:space="preserve">findings, decide whether they are right, and only then switch dry run off to record them.</w:t>
+      </w:r>
+      <w:r>
+        <w:t xml:space="preserve"> </w:t>
+      </w:r>
+      <w:r>
+        <w:t xml:space="preserve">The results panel always says plainly when nothing was written.</w:t>
       </w:r>
     </w:p>
     <w:p>
@@ -2920,87 +2931,84 @@
         <w:rPr>
           <w:b/>
         </w:rPr>
-        <w:t xml:space="preserve">Feature Flags</w:t>
-      </w:r>
-      <w:r>
-        <w:t xml:space="preserve"> </w:t>
-      </w:r>
-      <w:r>
-        <w:t xml:space="preserve">(platform admin) — operational toggles that apply within seconds and are written to the Audit Log: the agenda-discovery engine, the daily automated scan and its hour, and the ISO/IEC 42001 framework lens.</w:t>
-      </w:r>
-    </w:p>
-    <w:p>
-      <w:pPr>
-        <w:numPr>
-          <w:ilvl w:val="0"/>
-          <w:numId w:val="1010"/>
-        </w:numPr>
-        <w:pStyle w:val="Compact"/>
-      </w:pPr>
-      <w:r>
-        <w:rPr>
-          <w:b/>
-        </w:rPr>
-        <w:t xml:space="preserve">Version &amp; Build</w:t>
-      </w:r>
-      <w:r>
-        <w:t xml:space="preserve"> </w:t>
-      </w:r>
-      <w:r>
-        <w:t xml:space="preserve">— the deployed backend and frontend build identifiers and environment.</w:t>
-      </w:r>
-    </w:p>
-    <w:p>
-      <w:pPr>
-        <w:numPr>
-          <w:ilvl w:val="0"/>
-          <w:numId w:val="1010"/>
-        </w:numPr>
-        <w:pStyle w:val="Compact"/>
-      </w:pPr>
-      <w:r>
-        <w:rPr>
-          <w:b/>
-        </w:rPr>
-        <w:t xml:space="preserve">Storage / Backend API / Integrations / Deployment</w:t>
-      </w:r>
-      <w:r>
-        <w:t xml:space="preserve"> </w:t>
-      </w:r>
-      <w:r>
-        <w:t xml:space="preserve">— reference information about the running system.</w:t>
-      </w:r>
-    </w:p>
-    <w:p>
-      <w:pPr>
-        <w:numPr>
-          <w:ilvl w:val="0"/>
-          <w:numId w:val="1010"/>
-        </w:numPr>
-        <w:pStyle w:val="Compact"/>
-      </w:pPr>
-      <w:r>
-        <w:rPr>
-          <w:b/>
-        </w:rPr>
-        <w:t xml:space="preserve">API Health Check</w:t>
-      </w:r>
-      <w:r>
-        <w:t xml:space="preserve"> </w:t>
-      </w:r>
-      <w:r>
-        <w:t xml:space="preserve">— confirms the app can reach its backend.</w:t>
-      </w:r>
-    </w:p>
-    <w:p>
-      <w:pPr>
-        <w:pStyle w:val="Heading1"/>
-      </w:pPr>
-      <w:bookmarkStart w:id="43" w:name="audit-log-error-log"/>
-      <w:r>
-        <w:t xml:space="preserve">Audit Log &amp; Error Log</w:t>
-      </w:r>
-      <w:bookmarkEnd w:id="43"/>
+        <w:t xml:space="preserve">No employee names.</w:t>
+      </w:r>
+      <w:r>
+        <w:t xml:space="preserve"> </w:t>
+      </w:r>
+      <w:r>
+        <w:t xml:space="preserve">Only the</w:t>
+      </w:r>
+      <w:r>
+        <w:t xml:space="preserve"> </w:t>
+      </w:r>
+      <w:r>
+        <w:rPr>
+          <w:i/>
+        </w:rPr>
+        <w:t xml:space="preserve">number</w:t>
+      </w:r>
+      <w:r>
+        <w:t xml:space="preserve"> </w:t>
+      </w:r>
+      <w:r>
+        <w:t xml:space="preserve">of people who consented to each app is sent.</w:t>
+      </w:r>
+      <w:r>
+        <w:t xml:space="preserve"> </w:t>
+      </w:r>
+      <w:r>
+        <w:t xml:space="preserve">If the export was run with the optional identity flag, the names are removed in your</w:t>
+      </w:r>
+      <w:r>
+        <w:t xml:space="preserve"> </w:t>
+      </w:r>
+      <w:r>
+        <w:t xml:space="preserve">browser before anything is transmitted, and you are warned.</w:t>
+      </w:r>
+    </w:p>
+    <w:p>
+      <w:pPr>
+        <w:pStyle w:val="FirstParagraph"/>
+      </w:pPr>
+      <w:r>
+        <w:t xml:space="preserve">Findings are recorded as</w:t>
+      </w:r>
+      <w:r>
+        <w:t xml:space="preserve"> </w:t>
+      </w:r>
+      <w:r>
+        <w:rPr>
+          <w:b/>
+        </w:rPr>
+        <w:t xml:space="preserve">Procured · verify</w:t>
+      </w:r>
+      <w:r>
+        <w:t xml:space="preserve"> </w:t>
+      </w:r>
+      <w:r>
+        <w:t xml:space="preserve">— an employee consented to it, which is not</w:t>
+      </w:r>
+      <w:r>
+        <w:t xml:space="preserve"> </w:t>
+      </w:r>
+      <w:r>
+        <w:t xml:space="preserve">the same as the city running it. Confirm each one before treating it as a live obligation.</w:t>
+      </w:r>
+      <w:r>
+        <w:t xml:space="preserve"> </w:t>
+      </w:r>
+      <w:r>
+        <w:t xml:space="preserve">As with all record-based discovery, these never start a cure clock on their own.</w:t>
+      </w:r>
+    </w:p>
+    <w:p>
+      <w:pPr>
+        <w:pStyle w:val="BodyText"/>
+      </w:pPr>
+      <w:r>
+        <w:t xml:space="preserve">Two things are called out specially, because they change what you should do about them:</w:t>
+      </w:r>
     </w:p>
     <w:p>
       <w:pPr>
@@ -3014,13 +3022,34 @@
         <w:rPr>
           <w:b/>
         </w:rPr>
-        <w:t xml:space="preserve">Audit Log</w:t>
-      </w:r>
-      <w:r>
-        <w:t xml:space="preserve"> </w:t>
-      </w:r>
-      <w:r>
-        <w:t xml:space="preserve">is the append-only evidence trail: scans, configuration changes, attestations, and administrative actions, each with the acting user and time. This is what makes the platform’s record defensible.</w:t>
+        <w:t xml:space="preserve">Tenant-wide</w:t>
+      </w:r>
+      <w:r>
+        <w:t xml:space="preserve"> </w:t>
+      </w:r>
+      <w:r>
+        <w:t xml:space="preserve">— an administrator approved the application for your</w:t>
+      </w:r>
+      <w:r>
+        <w:t xml:space="preserve"> </w:t>
+      </w:r>
+      <w:r>
+        <w:rPr>
+          <w:i/>
+        </w:rPr>
+        <w:t xml:space="preserve">entire</w:t>
+      </w:r>
+      <w:r>
+        <w:t xml:space="preserve"> </w:t>
+      </w:r>
+      <w:r>
+        <w:t xml:space="preserve">organisation, so no individual employee ever consented to it. This is usually the most</w:t>
+      </w:r>
+      <w:r>
+        <w:t xml:space="preserve"> </w:t>
+      </w:r>
+      <w:r>
+        <w:t xml:space="preserve">significant item in a report and worth reviewing first.</w:t>
       </w:r>
     </w:p>
     <w:p>
@@ -3035,6 +3064,650 @@
         <w:rPr>
           <w:b/>
         </w:rPr>
+        <w:t xml:space="preserve">Applications we did not recognise</w:t>
+      </w:r>
+      <w:r>
+        <w:t xml:space="preserve"> </w:t>
+      </w:r>
+      <w:r>
+        <w:t xml:space="preserve">— listed separately at the end of the run. These</w:t>
+      </w:r>
+      <w:r>
+        <w:t xml:space="preserve"> </w:t>
+      </w:r>
+      <w:r>
+        <w:t xml:space="preserve">are</w:t>
+      </w:r>
+      <w:r>
+        <w:t xml:space="preserve"> </w:t>
+      </w:r>
+      <w:r>
+        <w:rPr>
+          <w:b/>
+        </w:rPr>
+        <w:t xml:space="preserve">not findings</w:t>
+      </w:r>
+      <w:r>
+        <w:t xml:space="preserve">; we simply have no catalog entry for them, and most will be</w:t>
+      </w:r>
+      <w:r>
+        <w:t xml:space="preserve"> </w:t>
+      </w:r>
+      <w:r>
+        <w:t xml:space="preserve">ordinary business software. Use</w:t>
+      </w:r>
+      <w:r>
+        <w:t xml:space="preserve"> </w:t>
+      </w:r>
+      <w:r>
+        <w:rPr>
+          <w:b/>
+        </w:rPr>
+        <w:t xml:space="preserve">Download for signature review</w:t>
+      </w:r>
+      <w:r>
+        <w:t xml:space="preserve"> </w:t>
+      </w:r>
+      <w:r>
+        <w:t xml:space="preserve">to save the list. If</w:t>
+      </w:r>
+      <w:r>
+        <w:t xml:space="preserve"> </w:t>
+      </w:r>
+      <w:r>
+        <w:t xml:space="preserve">you send it back to us, any AI tools among them become detectable for</w:t>
+      </w:r>
+      <w:r>
+        <w:t xml:space="preserve"> </w:t>
+      </w:r>
+      <w:r>
+        <w:rPr>
+          <w:i/>
+        </w:rPr>
+        <w:t xml:space="preserve">every</w:t>
+      </w:r>
+      <w:r>
+        <w:t xml:space="preserve"> </w:t>
+      </w:r>
+      <w:r>
+        <w:t xml:space="preserve">city on</w:t>
+      </w:r>
+      <w:r>
+        <w:t xml:space="preserve"> </w:t>
+      </w:r>
+      <w:r>
+        <w:t xml:space="preserve">the platform, not just yours. The file contains application names and publishers only —</w:t>
+      </w:r>
+      <w:r>
+        <w:t xml:space="preserve"> </w:t>
+      </w:r>
+      <w:r>
+        <w:t xml:space="preserve">no employee identities, ever.</w:t>
+      </w:r>
+    </w:p>
+    <w:p>
+      <w:pPr>
+        <w:pStyle w:val="BlockText"/>
+      </w:pPr>
+      <w:r>
+        <w:t xml:space="preserve">This channel is off until a platform administrator enables it in</w:t>
+      </w:r>
+      <w:r>
+        <w:t xml:space="preserve"> </w:t>
+      </w:r>
+      <w:r>
+        <w:rPr>
+          <w:b/>
+        </w:rPr>
+        <w:t xml:space="preserve">Settings → Feature Flags</w:t>
+      </w:r>
+      <w:r>
+        <w:t xml:space="preserve">.</w:t>
+      </w:r>
+    </w:p>
+    <w:p>
+      <w:pPr>
+        <w:pStyle w:val="Heading1"/>
+      </w:pPr>
+      <w:bookmarkStart w:id="38" w:name="safe-harbor-readiness-framework-lenses"/>
+      <w:r>
+        <w:t xml:space="preserve">Safe Harbor Readiness &amp; Framework Lenses</w:t>
+      </w:r>
+      <w:bookmarkEnd w:id="38"/>
+    </w:p>
+    <w:p>
+      <w:pPr>
+        <w:pStyle w:val="FirstParagraph"/>
+      </w:pPr>
+      <w:r>
+        <w:t xml:space="preserve">At the bottom of each city page,</w:t>
+      </w:r>
+      <w:r>
+        <w:t xml:space="preserve"> </w:t>
+      </w:r>
+      <w:r>
+        <w:rPr>
+          <w:b/>
+        </w:rPr>
+        <w:t xml:space="preserve">TRAIGA Safe Harbor Readiness</w:t>
+      </w:r>
+      <w:r>
+        <w:t xml:space="preserve"> </w:t>
+      </w:r>
+      <w:r>
+        <w:t xml:space="preserve">scores the city’s AI governance against the</w:t>
+      </w:r>
+      <w:r>
+        <w:t xml:space="preserve"> </w:t>
+      </w:r>
+      <w:r>
+        <w:rPr>
+          <w:b/>
+        </w:rPr>
+        <w:t xml:space="preserve">Municipal AI Profile</w:t>
+      </w:r>
+      <w:r>
+        <w:t xml:space="preserve"> </w:t>
+      </w:r>
+      <w:r>
+        <w:t xml:space="preserve">— a right-sized profile of the</w:t>
+      </w:r>
+      <w:r>
+        <w:t xml:space="preserve"> </w:t>
+      </w:r>
+      <w:r>
+        <w:rPr>
+          <w:b/>
+        </w:rPr>
+        <w:t xml:space="preserve">NIST AI Risk Management Framework</w:t>
+      </w:r>
+      <w:r>
+        <w:t xml:space="preserve"> </w:t>
+      </w:r>
+      <w:r>
+        <w:t xml:space="preserve">and its Generative AI Profile. This supports the reasonable-care presumption and internal-review defenses under</w:t>
+      </w:r>
+      <w:r>
+        <w:t xml:space="preserve"> </w:t>
+      </w:r>
+      <w:r>
+        <w:rPr>
+          <w:b/>
+        </w:rPr>
+        <w:t xml:space="preserve">Tex. Bus. &amp; Com. Code § 552.105(c)–(e)</w:t>
+      </w:r>
+      <w:r>
+        <w:t xml:space="preserve">.</w:t>
+      </w:r>
+    </w:p>
+    <w:p>
+      <w:pPr>
+        <w:pStyle w:val="Heading2"/>
+      </w:pPr>
+      <w:bookmarkStart w:id="39" w:name="the-four-functions"/>
+      <w:r>
+        <w:t xml:space="preserve">The four functions</w:t>
+      </w:r>
+      <w:bookmarkEnd w:id="39"/>
+    </w:p>
+    <w:p>
+      <w:pPr>
+        <w:pStyle w:val="FirstParagraph"/>
+      </w:pPr>
+      <w:r>
+        <w:t xml:space="preserve">Controls are grouped into the NIST functions —</w:t>
+      </w:r>
+      <w:r>
+        <w:t xml:space="preserve"> </w:t>
+      </w:r>
+      <w:r>
+        <w:rPr>
+          <w:b/>
+        </w:rPr>
+        <w:t xml:space="preserve">GOVERN, MAP, MEASURE, MANAGE</w:t>
+      </w:r>
+      <w:r>
+        <w:t xml:space="preserve"> </w:t>
+      </w:r>
+      <w:r>
+        <w:t xml:space="preserve">— each shown as a ring with a satisfied/total count.</w:t>
+      </w:r>
+    </w:p>
+    <w:p>
+      <w:pPr>
+        <w:pStyle w:val="Heading2"/>
+      </w:pPr>
+      <w:bookmarkStart w:id="40" w:name="machine-verified-vs.-attested-controls"/>
+      <w:r>
+        <w:t xml:space="preserve">Machine-verified vs. attested controls</w:t>
+      </w:r>
+      <w:bookmarkEnd w:id="40"/>
+    </w:p>
+    <w:p>
+      <w:pPr>
+        <w:numPr>
+          <w:ilvl w:val="0"/>
+          <w:numId w:val="1012"/>
+        </w:numPr>
+        <w:pStyle w:val="Compact"/>
+      </w:pPr>
+      <w:r>
+        <w:rPr>
+          <w:b/>
+        </w:rPr>
+        <w:t xml:space="preserve">Machine-verified</w:t>
+      </w:r>
+      <w:r>
+        <w:t xml:space="preserve"> </w:t>
+      </w:r>
+      <w:r>
+        <w:t xml:space="preserve">controls are satisfied automatically from platform data (for example,</w:t>
+      </w:r>
+      <w:r>
+        <w:t xml:space="preserve"> </w:t>
+      </w:r>
+      <w:r>
+        <w:t xml:space="preserve">“</w:t>
+      </w:r>
+      <w:r>
+        <w:t xml:space="preserve">public-facing AI is actively discovered</w:t>
+      </w:r>
+      <w:r>
+        <w:t xml:space="preserve">”</w:t>
+      </w:r>
+      <w:r>
+        <w:t xml:space="preserve"> </w:t>
+      </w:r>
+      <w:r>
+        <w:t xml:space="preserve">is proven by the scanner;</w:t>
+      </w:r>
+      <w:r>
+        <w:t xml:space="preserve"> </w:t>
+      </w:r>
+      <w:r>
+        <w:t xml:space="preserve">“</w:t>
+      </w:r>
+      <w:r>
+        <w:t xml:space="preserve">findings are tracked with cure deadlines</w:t>
+      </w:r>
+      <w:r>
+        <w:t xml:space="preserve">”</w:t>
+      </w:r>
+      <w:r>
+        <w:t xml:space="preserve"> </w:t>
+      </w:r>
+      <w:r>
+        <w:t xml:space="preserve">by the cure clock). These show a</w:t>
+      </w:r>
+      <w:r>
+        <w:t xml:space="preserve"> </w:t>
+      </w:r>
+      <w:r>
+        <w:t xml:space="preserve">“</w:t>
+      </w:r>
+      <w:r>
+        <w:t xml:space="preserve">Machine-verified from platform data</w:t>
+      </w:r>
+      <w:r>
+        <w:t xml:space="preserve">”</w:t>
+      </w:r>
+      <w:r>
+        <w:t xml:space="preserve"> </w:t>
+      </w:r>
+      <w:r>
+        <w:t xml:space="preserve">note.</w:t>
+      </w:r>
+    </w:p>
+    <w:p>
+      <w:pPr>
+        <w:numPr>
+          <w:ilvl w:val="0"/>
+          <w:numId w:val="1012"/>
+        </w:numPr>
+        <w:pStyle w:val="Compact"/>
+      </w:pPr>
+      <w:r>
+        <w:rPr>
+          <w:b/>
+        </w:rPr>
+        <w:t xml:space="preserve">Attested</w:t>
+      </w:r>
+      <w:r>
+        <w:t xml:space="preserve"> </w:t>
+      </w:r>
+      <w:r>
+        <w:t xml:space="preserve">controls are things the platform cannot observe (for example,</w:t>
+      </w:r>
+      <w:r>
+        <w:t xml:space="preserve"> </w:t>
+      </w:r>
+      <w:r>
+        <w:t xml:space="preserve">“</w:t>
+      </w:r>
+      <w:r>
+        <w:t xml:space="preserve">an AI use policy is adopted</w:t>
+      </w:r>
+      <w:r>
+        <w:t xml:space="preserve">”</w:t>
+      </w:r>
+      <w:r>
+        <w:t xml:space="preserve">). An admin marks these satisfied with the</w:t>
+      </w:r>
+      <w:r>
+        <w:t xml:space="preserve"> </w:t>
+      </w:r>
+      <w:r>
+        <w:rPr>
+          <w:b/>
+        </w:rPr>
+        <w:t xml:space="preserve">Attest</w:t>
+      </w:r>
+      <w:r>
+        <w:t xml:space="preserve"> </w:t>
+      </w:r>
+      <w:r>
+        <w:t xml:space="preserve">button, adding evidence notes and a timestamp that appear in generated documentation. Use</w:t>
+      </w:r>
+      <w:r>
+        <w:t xml:space="preserve"> </w:t>
+      </w:r>
+      <w:r>
+        <w:rPr>
+          <w:b/>
+        </w:rPr>
+        <w:t xml:space="preserve">Clear</w:t>
+      </w:r>
+      <w:r>
+        <w:t xml:space="preserve"> </w:t>
+      </w:r>
+      <w:r>
+        <w:t xml:space="preserve">to remove an attestation.</w:t>
+      </w:r>
+    </w:p>
+    <w:p>
+      <w:pPr>
+        <w:pStyle w:val="Heading2"/>
+      </w:pPr>
+      <w:bookmarkStart w:id="41" w:name="framework-lenses-nist-iso-42001"/>
+      <w:r>
+        <w:t xml:space="preserve">Framework lenses (NIST / ISO 42001)</w:t>
+      </w:r>
+      <w:bookmarkEnd w:id="41"/>
+    </w:p>
+    <w:p>
+      <w:pPr>
+        <w:pStyle w:val="FirstParagraph"/>
+      </w:pPr>
+      <w:r>
+        <w:t xml:space="preserve">When more than one framework is enabled, a</w:t>
+      </w:r>
+      <w:r>
+        <w:t xml:space="preserve"> </w:t>
+      </w:r>
+      <w:r>
+        <w:rPr>
+          <w:b/>
+        </w:rPr>
+        <w:t xml:space="preserve">Framework lens</w:t>
+      </w:r>
+      <w:r>
+        <w:t xml:space="preserve"> </w:t>
+      </w:r>
+      <w:r>
+        <w:t xml:space="preserve">selector appears. Switching it re-labels each control with the selected framework’s reference (for example, the ISO/IEC 42001 Annex A objective) and shows an</w:t>
+      </w:r>
+      <w:r>
+        <w:t xml:space="preserve"> </w:t>
+      </w:r>
+      <w:r>
+        <w:rPr>
+          <w:b/>
+        </w:rPr>
+        <w:t xml:space="preserve">overlap grade</w:t>
+      </w:r>
+      <w:r>
+        <w:t xml:space="preserve"> </w:t>
+      </w:r>
+      <w:r>
+        <w:t xml:space="preserve">—</w:t>
+      </w:r>
+      <w:r>
+        <w:t xml:space="preserve"> </w:t>
+      </w:r>
+      <w:r>
+        <w:rPr>
+          <w:i/>
+        </w:rPr>
+        <w:t xml:space="preserve">strong</w:t>
+      </w:r>
+      <w:r>
+        <w:t xml:space="preserve">,</w:t>
+      </w:r>
+      <w:r>
+        <w:t xml:space="preserve"> </w:t>
+      </w:r>
+      <w:r>
+        <w:rPr>
+          <w:i/>
+        </w:rPr>
+        <w:t xml:space="preserve">partial</w:t>
+      </w:r>
+      <w:r>
+        <w:t xml:space="preserve">, or</w:t>
+      </w:r>
+      <w:r>
+        <w:t xml:space="preserve"> </w:t>
+      </w:r>
+      <w:r>
+        <w:rPr>
+          <w:i/>
+        </w:rPr>
+        <w:t xml:space="preserve">weak</w:t>
+      </w:r>
+      <w:r>
+        <w:t xml:space="preserve"> </w:t>
+      </w:r>
+      <w:r>
+        <w:t xml:space="preserve">— for how closely the control maps. The underlying assessment does not change; only the labels do. This is how one assessment is reported in several frameworks (</w:t>
+      </w:r>
+      <w:r>
+        <w:t xml:space="preserve">“</w:t>
+      </w:r>
+      <w:r>
+        <w:t xml:space="preserve">assess once, report many</w:t>
+      </w:r>
+      <w:r>
+        <w:t xml:space="preserve">”</w:t>
+      </w:r>
+      <w:r>
+        <w:t xml:space="preserve">). Crosswalk mappings are a positioning aid, not legal advice.</w:t>
+      </w:r>
+    </w:p>
+    <w:p>
+      <w:pPr>
+        <w:pStyle w:val="Heading2"/>
+      </w:pPr>
+      <w:bookmarkStart w:id="42" w:name="alignment-statement"/>
+      <w:r>
+        <w:t xml:space="preserve">Alignment Statement</w:t>
+      </w:r>
+      <w:bookmarkEnd w:id="42"/>
+    </w:p>
+    <w:p>
+      <w:pPr>
+        <w:pStyle w:val="FirstParagraph"/>
+      </w:pPr>
+      <w:r>
+        <w:rPr>
+          <w:b/>
+        </w:rPr>
+        <w:t xml:space="preserve">Alignment Statement</w:t>
+      </w:r>
+      <w:r>
+        <w:t xml:space="preserve"> </w:t>
+      </w:r>
+      <w:r>
+        <w:t xml:space="preserve">generates a Word document summarizing the city’s readiness for the safe-harbor defense. It requires counsel review — the document says so itself.</w:t>
+      </w:r>
+    </w:p>
+    <w:p>
+      <w:pPr>
+        <w:pStyle w:val="Heading1"/>
+      </w:pPr>
+      <w:bookmarkStart w:id="43" w:name="settings"/>
+      <w:r>
+        <w:t xml:space="preserve">Settings</w:t>
+      </w:r>
+      <w:bookmarkEnd w:id="43"/>
+    </w:p>
+    <w:p>
+      <w:pPr>
+        <w:numPr>
+          <w:ilvl w:val="0"/>
+          <w:numId w:val="1013"/>
+        </w:numPr>
+        <w:pStyle w:val="Compact"/>
+      </w:pPr>
+      <w:r>
+        <w:rPr>
+          <w:b/>
+        </w:rPr>
+        <w:t xml:space="preserve">Appearance</w:t>
+      </w:r>
+      <w:r>
+        <w:t xml:space="preserve"> </w:t>
+      </w:r>
+      <w:r>
+        <w:t xml:space="preserve">— choose the Light or Stealth interface theme (saved per browser).</w:t>
+      </w:r>
+    </w:p>
+    <w:p>
+      <w:pPr>
+        <w:numPr>
+          <w:ilvl w:val="0"/>
+          <w:numId w:val="1013"/>
+        </w:numPr>
+        <w:pStyle w:val="Compact"/>
+      </w:pPr>
+      <w:r>
+        <w:rPr>
+          <w:b/>
+        </w:rPr>
+        <w:t xml:space="preserve">Feature Flags</w:t>
+      </w:r>
+      <w:r>
+        <w:t xml:space="preserve"> </w:t>
+      </w:r>
+      <w:r>
+        <w:t xml:space="preserve">(platform admin) — operational toggles that apply within seconds and are written to the Audit Log: the agenda-discovery engine, OAuth shadow-AI discovery, the daily automated scan and its hour, and the ISO/IEC 42001 framework lens.</w:t>
+      </w:r>
+    </w:p>
+    <w:p>
+      <w:pPr>
+        <w:numPr>
+          <w:ilvl w:val="0"/>
+          <w:numId w:val="1013"/>
+        </w:numPr>
+        <w:pStyle w:val="Compact"/>
+      </w:pPr>
+      <w:r>
+        <w:rPr>
+          <w:b/>
+        </w:rPr>
+        <w:t xml:space="preserve">Version &amp; Build</w:t>
+      </w:r>
+      <w:r>
+        <w:t xml:space="preserve"> </w:t>
+      </w:r>
+      <w:r>
+        <w:t xml:space="preserve">— the deployed backend and frontend build identifiers and environment.</w:t>
+      </w:r>
+    </w:p>
+    <w:p>
+      <w:pPr>
+        <w:numPr>
+          <w:ilvl w:val="0"/>
+          <w:numId w:val="1013"/>
+        </w:numPr>
+        <w:pStyle w:val="Compact"/>
+      </w:pPr>
+      <w:r>
+        <w:rPr>
+          <w:b/>
+        </w:rPr>
+        <w:t xml:space="preserve">Storage / Backend API / Integrations / Deployment</w:t>
+      </w:r>
+      <w:r>
+        <w:t xml:space="preserve"> </w:t>
+      </w:r>
+      <w:r>
+        <w:t xml:space="preserve">— reference information about the running system.</w:t>
+      </w:r>
+    </w:p>
+    <w:p>
+      <w:pPr>
+        <w:numPr>
+          <w:ilvl w:val="0"/>
+          <w:numId w:val="1013"/>
+        </w:numPr>
+        <w:pStyle w:val="Compact"/>
+      </w:pPr>
+      <w:r>
+        <w:rPr>
+          <w:b/>
+        </w:rPr>
+        <w:t xml:space="preserve">API Health Check</w:t>
+      </w:r>
+      <w:r>
+        <w:t xml:space="preserve"> </w:t>
+      </w:r>
+      <w:r>
+        <w:t xml:space="preserve">— confirms the app can reach its backend.</w:t>
+      </w:r>
+    </w:p>
+    <w:p>
+      <w:pPr>
+        <w:pStyle w:val="Heading1"/>
+      </w:pPr>
+      <w:bookmarkStart w:id="44" w:name="audit-log-error-log"/>
+      <w:r>
+        <w:t xml:space="preserve">Audit Log &amp; Error Log</w:t>
+      </w:r>
+      <w:bookmarkEnd w:id="44"/>
+    </w:p>
+    <w:p>
+      <w:pPr>
+        <w:numPr>
+          <w:ilvl w:val="0"/>
+          <w:numId w:val="1014"/>
+        </w:numPr>
+        <w:pStyle w:val="Compact"/>
+      </w:pPr>
+      <w:r>
+        <w:rPr>
+          <w:b/>
+        </w:rPr>
+        <w:t xml:space="preserve">Audit Log</w:t>
+      </w:r>
+      <w:r>
+        <w:t xml:space="preserve"> </w:t>
+      </w:r>
+      <w:r>
+        <w:t xml:space="preserve">is the append-only evidence trail: scans, configuration changes, attestations, and administrative actions, each with the acting user and time. This is what makes the platform’s record defensible.</w:t>
+      </w:r>
+    </w:p>
+    <w:p>
+      <w:pPr>
+        <w:numPr>
+          <w:ilvl w:val="0"/>
+          <w:numId w:val="1014"/>
+        </w:numPr>
+        <w:pStyle w:val="Compact"/>
+      </w:pPr>
+      <w:r>
+        <w:rPr>
+          <w:b/>
+        </w:rPr>
         <w:t xml:space="preserve">Error Log</w:t>
       </w:r>
       <w:r>
@@ -3048,11 +3721,11 @@
       <w:pPr>
         <w:pStyle w:val="Heading1"/>
       </w:pPr>
-      <w:bookmarkStart w:id="44" w:name="sentinel-dlp"/>
+      <w:bookmarkStart w:id="45" w:name="sentinel-dlp"/>
       <w:r>
         <w:t xml:space="preserve">Sentinel (DLP)</w:t>
       </w:r>
-      <w:bookmarkEnd w:id="44"/>
+      <w:bookmarkEnd w:id="45"/>
     </w:p>
     <w:p>
       <w:pPr>
@@ -3066,11 +3739,11 @@
       <w:pPr>
         <w:pStyle w:val="Heading1"/>
       </w:pPr>
-      <w:bookmarkStart w:id="45" w:name="glossary"/>
+      <w:bookmarkStart w:id="46" w:name="glossary"/>
       <w:r>
         <w:t xml:space="preserve">Glossary</w:t>
       </w:r>
-      <w:bookmarkEnd w:id="45"/>
+      <w:bookmarkEnd w:id="46"/>
     </w:p>
     <w:tbl>
       <w:tblPr>
@@ -3450,11 +4123,11 @@
       <w:pPr>
         <w:pStyle w:val="Heading1"/>
       </w:pPr>
-      <w:bookmarkStart w:id="46" w:name="important-disclaimers"/>
+      <w:bookmarkStart w:id="47" w:name="important-disclaimers"/>
       <w:r>
         <w:t xml:space="preserve">Important Disclaimers</w:t>
       </w:r>
-      <w:bookmarkEnd w:id="46"/>
+      <w:bookmarkEnd w:id="47"/>
     </w:p>
     <w:p>
       <w:pPr>
@@ -3734,6 +4407,15 @@
     <w:abstractNumId w:val="991"/>
   </w:num>
   <w:num w:numId="1011">
+    <w:abstractNumId w:val="991"/>
+  </w:num>
+  <w:num w:numId="1012">
+    <w:abstractNumId w:val="991"/>
+  </w:num>
+  <w:num w:numId="1013">
+    <w:abstractNumId w:val="991"/>
+  </w:num>
+  <w:num w:numId="1014">
     <w:abstractNumId w:val="991"/>
   </w:num>
 </w:numbering>

</xml_diff>

<commit_message>
feat(ui): Slice UI-3b - Add Data menu, flat stat tiles, humanized labels (01.16)
Crisp pass from the 2026-08-23 live-app audit, approach approved by Chris. Inventory toolbar: four discovery buttons consolidated into one quiet Add Data menu (identical permissions and handlers; tooltips became item subtitles) with Declare AI System as the single filled primary. All KPI stat tiles (Dashboard 8, Inventory 4) move from tinted-tonal to flat surface + hairline with the numeral carrying the semantic color, per the approved design canvas. City Detail: Compliance Report and AI Use Policy become outlined primaries so Re-Audit is the one filled action; Deep Scan flat; raw enum unverified_candidate now renders via verificationLabel(). User guide bumped to v1.7 with md + handout docx + in-app PDF regenerated in this same commit (update-user-guide rule). Zero backend change.

Release: 01.16

Ship-Bat: ship_crisp_toolbars_tiles.bat
</commit_message>
<xml_diff>
--- a/TRAIGA_Auditor_User_Guide_v1.docx
+++ b/TRAIGA_Auditor_User_Guide_v1.docx
@@ -93,7 +93,7 @@
         <w:t xml:space="preserve"> </w:t>
       </w:r>
       <w:r>
-        <w:t xml:space="preserve">1.6</w:t>
+        <w:t xml:space="preserve">1.7</w:t>
       </w:r>
     </w:p>
     <w:p>
@@ -107,7 +107,7 @@
         <w:t xml:space="preserve"> </w:t>
       </w:r>
       <w:r>
-        <w:t xml:space="preserve">21,</w:t>
+        <w:t xml:space="preserve">23,</w:t>
       </w:r>
       <w:r>
         <w:t xml:space="preserve"> </w:t>
@@ -190,15 +190,14 @@
         </w:p>
       </w:sdtContent>
     </w:sdt>
+    <w:bookmarkStart w:id="20" w:name="about-traiga-auditor"/>
     <w:p>
       <w:pPr>
         <w:pStyle w:val="Heading1"/>
       </w:pPr>
-      <w:bookmarkStart w:id="20" w:name="about-traiga-auditor"/>
       <w:r>
         <w:t xml:space="preserve">About TRAIGA Auditor</w:t>
       </w:r>
-      <w:bookmarkEnd w:id="20"/>
     </w:p>
     <w:p>
       <w:pPr>
@@ -212,6 +211,7 @@
       </w:r>
       <w:r>
         <w:rPr>
+          <w:bCs/>
           <w:b/>
         </w:rPr>
         <w:t xml:space="preserve">Texas Responsible Artificial Intelligence Governance Act (TRAIGA / House Bill 149, Tex. Bus. &amp; Com. Code Ch. 552)</w:t>
@@ -238,6 +238,7 @@
       </w:pPr>
       <w:r>
         <w:rPr>
+          <w:bCs/>
           <w:b/>
         </w:rPr>
         <w:t xml:space="preserve">Discovers</w:t>
@@ -259,6 +260,7 @@
       </w:pPr>
       <w:r>
         <w:rPr>
+          <w:bCs/>
           <w:b/>
         </w:rPr>
         <w:t xml:space="preserve">Assesses</w:t>
@@ -298,6 +300,7 @@
       </w:pPr>
       <w:r>
         <w:rPr>
+          <w:bCs/>
           <w:b/>
         </w:rPr>
         <w:t xml:space="preserve">Documents</w:t>
@@ -315,6 +318,7 @@
       </w:pPr>
       <w:r>
         <w:rPr>
+          <w:bCs/>
           <w:b/>
         </w:rPr>
         <w:t xml:space="preserve">Who this guide is for:</w:t>
@@ -332,6 +336,7 @@
       </w:pPr>
       <w:r>
         <w:rPr>
+          <w:bCs/>
           <w:b/>
         </w:rPr>
         <w:t xml:space="preserve">Important — please read.</w:t>
@@ -347,6 +352,7 @@
       </w:r>
       <w:r>
         <w:rPr>
+          <w:bCs/>
           <w:b/>
         </w:rPr>
         <w:t xml:space="preserve">candidate compliance signals</w:t>
@@ -362,6 +368,7 @@
       </w:r>
       <w:r>
         <w:rPr>
+          <w:bCs/>
           <w:b/>
         </w:rPr>
         <w:t xml:space="preserve">not</w:t>
@@ -377,6 +384,7 @@
       </w:r>
       <w:r>
         <w:rPr>
+          <w:bCs/>
           <w:b/>
         </w:rPr>
         <w:t xml:space="preserve">do not</w:t>
@@ -388,25 +396,24 @@
         <w:t xml:space="preserve">constitute legal advice. Every finding requires human and legal review before any action. Statutory citations reference Texas HB 149 / Ch. 552; re-validate against the enrolled bill with counsel. The scanner is an out-of-line observer — it never modifies or disrupts a target system.</w:t>
       </w:r>
     </w:p>
+    <w:bookmarkEnd w:id="20"/>
+    <w:bookmarkStart w:id="23" w:name="getting-started"/>
     <w:p>
       <w:pPr>
         <w:pStyle w:val="Heading1"/>
       </w:pPr>
-      <w:bookmarkStart w:id="21" w:name="getting-started"/>
       <w:r>
         <w:t xml:space="preserve">Getting Started</w:t>
       </w:r>
-      <w:bookmarkEnd w:id="21"/>
-    </w:p>
+    </w:p>
+    <w:bookmarkStart w:id="21" w:name="signing-in-and-roles"/>
     <w:p>
       <w:pPr>
         <w:pStyle w:val="Heading2"/>
       </w:pPr>
-      <w:bookmarkStart w:id="22" w:name="signing-in-and-roles"/>
       <w:r>
         <w:t xml:space="preserve">Signing in and roles</w:t>
       </w:r>
-      <w:bookmarkEnd w:id="22"/>
     </w:p>
     <w:p>
       <w:pPr>
@@ -419,8 +426,9 @@
     <w:tbl>
       <w:tblPr>
         <w:tblStyle w:val="Table"/>
-        <w:tblW w:type="pct" w:w="5000.0"/>
-        <w:tblLook w:firstRow="1"/>
+        <w:tblW w:type="pct" w:w="5000"/>
+        <w:tblLook w:firstRow="1" w:lastRow="0" w:firstColumn="0" w:lastColumn="0" w:noHBand="0" w:noVBand="0" w:val="0020"/>
+        <w:jc w:val="start"/>
       </w:tblPr>
       <w:tblGrid>
         <w:gridCol w:w="3960"/>
@@ -428,15 +436,10 @@
       </w:tblGrid>
       <w:tr>
         <w:trPr>
-          <w:cnfStyle w:firstRow="1"/>
+          <w:tblHeader w:val="true"/>
         </w:trPr>
         <w:tc>
-          <w:tcPr>
-            <w:tcBorders>
-              <w:bottom w:val="single"/>
-            </w:tcBorders>
-            <w:vAlign w:val="bottom"/>
-          </w:tcPr>
+          <w:tcPr/>
           <w:p>
             <w:pPr>
               <w:pStyle w:val="Compact"/>
@@ -448,12 +451,7 @@
           </w:p>
         </w:tc>
         <w:tc>
-          <w:tcPr>
-            <w:tcBorders>
-              <w:bottom w:val="single"/>
-            </w:tcBorders>
-            <w:vAlign w:val="bottom"/>
-          </w:tcPr>
+          <w:tcPr/>
           <w:p>
             <w:pPr>
               <w:pStyle w:val="Compact"/>
@@ -467,6 +465,7 @@
       </w:tr>
       <w:tr>
         <w:tc>
+          <w:tcPr/>
           <w:p>
             <w:pPr>
               <w:pStyle w:val="Compact"/>
@@ -474,6 +473,7 @@
             </w:pPr>
             <w:r>
               <w:rPr>
+                <w:bCs/>
                 <w:b/>
               </w:rPr>
               <w:t xml:space="preserve">Viewer</w:t>
@@ -481,6 +481,7 @@
           </w:p>
         </w:tc>
         <w:tc>
+          <w:tcPr/>
           <w:p>
             <w:pPr>
               <w:pStyle w:val="Compact"/>
@@ -494,6 +495,7 @@
       </w:tr>
       <w:tr>
         <w:tc>
+          <w:tcPr/>
           <w:p>
             <w:pPr>
               <w:pStyle w:val="Compact"/>
@@ -501,6 +503,7 @@
             </w:pPr>
             <w:r>
               <w:rPr>
+                <w:bCs/>
                 <w:b/>
               </w:rPr>
               <w:t xml:space="preserve">Agency Admin</w:t>
@@ -508,6 +511,7 @@
           </w:p>
         </w:tc>
         <w:tc>
+          <w:tcPr/>
           <w:p>
             <w:pPr>
               <w:pStyle w:val="Compact"/>
@@ -521,6 +525,7 @@
       </w:tr>
       <w:tr>
         <w:tc>
+          <w:tcPr/>
           <w:p>
             <w:pPr>
               <w:pStyle w:val="Compact"/>
@@ -528,6 +533,7 @@
             </w:pPr>
             <w:r>
               <w:rPr>
+                <w:bCs/>
                 <w:b/>
               </w:rPr>
               <w:t xml:space="preserve">Platform Admin</w:t>
@@ -535,6 +541,7 @@
           </w:p>
         </w:tc>
         <w:tc>
+          <w:tcPr/>
           <w:p>
             <w:pPr>
               <w:pStyle w:val="Compact"/>
@@ -547,15 +554,15 @@
         </w:tc>
       </w:tr>
     </w:tbl>
+    <w:bookmarkEnd w:id="21"/>
+    <w:bookmarkStart w:id="22" w:name="finding-your-way-around"/>
     <w:p>
       <w:pPr>
         <w:pStyle w:val="Heading2"/>
       </w:pPr>
-      <w:bookmarkStart w:id="23" w:name="finding-your-way-around"/>
       <w:r>
         <w:t xml:space="preserve">Finding your way around</w:t>
       </w:r>
-      <w:bookmarkEnd w:id="23"/>
     </w:p>
     <w:p>
       <w:pPr>
@@ -575,6 +582,7 @@
       </w:pPr>
       <w:r>
         <w:rPr>
+          <w:bCs/>
           <w:b/>
         </w:rPr>
         <w:t xml:space="preserve">Dashboard</w:t>
@@ -596,6 +604,7 @@
       </w:pPr>
       <w:r>
         <w:rPr>
+          <w:bCs/>
           <w:b/>
         </w:rPr>
         <w:t xml:space="preserve">Analytics</w:t>
@@ -617,6 +626,7 @@
       </w:pPr>
       <w:r>
         <w:rPr>
+          <w:bCs/>
           <w:b/>
         </w:rPr>
         <w:t xml:space="preserve">AI Inventory</w:t>
@@ -638,6 +648,7 @@
       </w:pPr>
       <w:r>
         <w:rPr>
+          <w:bCs/>
           <w:b/>
         </w:rPr>
         <w:t xml:space="preserve">Violations</w:t>
@@ -659,6 +670,7 @@
       </w:pPr>
       <w:r>
         <w:rPr>
+          <w:bCs/>
           <w:b/>
         </w:rPr>
         <w:t xml:space="preserve">Sentinel (DLP)</w:t>
@@ -680,6 +692,7 @@
       </w:pPr>
       <w:r>
         <w:rPr>
+          <w:bCs/>
           <w:b/>
         </w:rPr>
         <w:t xml:space="preserve">Target Registry</w:t>
@@ -701,6 +714,7 @@
       </w:pPr>
       <w:r>
         <w:rPr>
+          <w:bCs/>
           <w:b/>
         </w:rPr>
         <w:t xml:space="preserve">Audit Log / Error Log</w:t>
@@ -722,6 +736,7 @@
       </w:pPr>
       <w:r>
         <w:rPr>
+          <w:bCs/>
           <w:b/>
         </w:rPr>
         <w:t xml:space="preserve">Administration / Settings</w:t>
@@ -739,6 +754,7 @@
       </w:pPr>
       <w:r>
         <w:rPr>
+          <w:bCs/>
           <w:b/>
         </w:rPr>
         <w:t xml:space="preserve">Light or Stealth theme:</w:t>
@@ -774,6 +790,7 @@
       </w:pPr>
       <w:r>
         <w:rPr>
+          <w:bCs/>
           <w:b/>
         </w:rPr>
         <w:t xml:space="preserve">On a phone or tablet:</w:t>
@@ -789,6 +806,7 @@
       </w:r>
       <w:r>
         <w:rPr>
+          <w:bCs/>
           <w:b/>
         </w:rPr>
         <w:t xml:space="preserve">☰ menu button</w:t>
@@ -800,15 +818,16 @@
         <w:t xml:space="preserve">in the top bar to open it, then tap where you want to go — the menu closes itself. Wide tables reshape into stacked cards so you can read them without scrolling sideways. On a laptop or desktop the menu stays open on the left as usual.</w:t>
       </w:r>
     </w:p>
+    <w:bookmarkEnd w:id="22"/>
+    <w:bookmarkEnd w:id="23"/>
+    <w:bookmarkStart w:id="24" w:name="the-dashboard"/>
     <w:p>
       <w:pPr>
         <w:pStyle w:val="Heading1"/>
       </w:pPr>
-      <w:bookmarkStart w:id="24" w:name="the-dashboard"/>
       <w:r>
         <w:t xml:space="preserve">The Dashboard</w:t>
       </w:r>
-      <w:bookmarkEnd w:id="24"/>
     </w:p>
     <w:p>
       <w:pPr>
@@ -824,6 +843,7 @@
       </w:pPr>
       <w:r>
         <w:rPr>
+          <w:bCs/>
           <w:b/>
         </w:rPr>
         <w:t xml:space="preserve">Status tiles</w:t>
@@ -841,6 +861,7 @@
       </w:pPr>
       <w:r>
         <w:rPr>
+          <w:bCs/>
           <w:b/>
         </w:rPr>
         <w:t xml:space="preserve">Texas Compliance Map</w:t>
@@ -858,6 +879,7 @@
       </w:pPr>
       <w:r>
         <w:rPr>
+          <w:bCs/>
           <w:b/>
         </w:rPr>
         <w:t xml:space="preserve">Cure Deadlines</w:t>
@@ -875,6 +897,7 @@
       </w:pPr>
       <w:r>
         <w:rPr>
+          <w:bCs/>
           <w:b/>
         </w:rPr>
         <w:t xml:space="preserve">City Compliance Scorecard</w:t>
@@ -890,6 +913,7 @@
       </w:r>
       <w:r>
         <w:rPr>
+          <w:bCs/>
           <w:b/>
         </w:rPr>
         <w:t xml:space="preserve">Report</w:t>
@@ -913,6 +937,7 @@
       </w:r>
       <w:r>
         <w:rPr>
+          <w:bCs/>
           <w:b/>
         </w:rPr>
         <w:t xml:space="preserve">Add City</w:t>
@@ -928,6 +953,7 @@
       </w:r>
       <w:r>
         <w:rPr>
+          <w:bCs/>
           <w:b/>
         </w:rPr>
         <w:t xml:space="preserve">Run Audit</w:t>
@@ -939,15 +965,15 @@
         <w:t xml:space="preserve">(scan all active cities).</w:t>
       </w:r>
     </w:p>
+    <w:bookmarkEnd w:id="24"/>
+    <w:bookmarkStart w:id="29" w:name="managing-your-cities-target-registry"/>
     <w:p>
       <w:pPr>
         <w:pStyle w:val="Heading1"/>
       </w:pPr>
-      <w:bookmarkStart w:id="25" w:name="managing-your-cities-target-registry"/>
       <w:r>
         <w:t xml:space="preserve">Managing Your Cities (Target Registry)</w:t>
       </w:r>
-      <w:bookmarkEnd w:id="25"/>
     </w:p>
     <w:p>
       <w:pPr>
@@ -957,15 +983,14 @@
         <w:t xml:space="preserve">The Target Registry is the list of city websites you monitor.</w:t>
       </w:r>
     </w:p>
+    <w:bookmarkStart w:id="25" w:name="add-a-single-city"/>
     <w:p>
       <w:pPr>
         <w:pStyle w:val="Heading2"/>
       </w:pPr>
-      <w:bookmarkStart w:id="26" w:name="add-a-single-city"/>
       <w:r>
         <w:t xml:space="preserve">Add a single city</w:t>
       </w:r>
-      <w:bookmarkEnd w:id="26"/>
     </w:p>
     <w:p>
       <w:pPr>
@@ -979,6 +1004,7 @@
       </w:r>
       <w:r>
         <w:rPr>
+          <w:bCs/>
           <w:b/>
         </w:rPr>
         <w:t xml:space="preserve">Add Target</w:t>
@@ -1017,15 +1043,15 @@
         <w:t xml:space="preserve">on to get results right away, or off to add it quietly.</w:t>
       </w:r>
     </w:p>
+    <w:bookmarkEnd w:id="25"/>
+    <w:bookmarkStart w:id="26" w:name="bulk-import-many-cities"/>
     <w:p>
       <w:pPr>
         <w:pStyle w:val="Heading2"/>
       </w:pPr>
-      <w:bookmarkStart w:id="27" w:name="bulk-import-many-cities"/>
       <w:r>
         <w:t xml:space="preserve">Bulk import many cities</w:t>
       </w:r>
-      <w:bookmarkEnd w:id="27"/>
     </w:p>
     <w:p>
       <w:pPr>
@@ -1039,6 +1065,7 @@
       </w:r>
       <w:r>
         <w:rPr>
+          <w:bCs/>
           <w:b/>
         </w:rPr>
         <w:t xml:space="preserve">Bulk Import</w:t>
@@ -1096,6 +1123,7 @@
       </w:r>
       <w:r>
         <w:rPr>
+          <w:bCs/>
           <w:b/>
         </w:rPr>
         <w:t xml:space="preserve">Not Assessed</w:t>
@@ -1111,6 +1139,7 @@
       </w:r>
       <w:r>
         <w:rPr>
+          <w:bCs/>
           <w:b/>
         </w:rPr>
         <w:t xml:space="preserve">not scanned automatically</w:t>
@@ -1122,15 +1151,15 @@
         <w:t xml:space="preserve">— you run a scan when ready. Duplicate cities and domains are skipped automatically.</w:t>
       </w:r>
     </w:p>
+    <w:bookmarkEnd w:id="26"/>
+    <w:bookmarkStart w:id="27" w:name="edit-or-remove-a-city"/>
     <w:p>
       <w:pPr>
         <w:pStyle w:val="Heading2"/>
       </w:pPr>
-      <w:bookmarkStart w:id="28" w:name="edit-or-remove-a-city"/>
       <w:r>
         <w:t xml:space="preserve">Edit or remove a city</w:t>
       </w:r>
-      <w:bookmarkEnd w:id="28"/>
     </w:p>
     <w:p>
       <w:pPr>
@@ -1144,6 +1173,7 @@
       </w:r>
       <w:r>
         <w:rPr>
+          <w:bCs/>
           <w:b/>
         </w:rPr>
         <w:t xml:space="preserve">pencil</w:t>
@@ -1159,6 +1189,7 @@
       </w:r>
       <w:r>
         <w:rPr>
+          <w:bCs/>
           <w:b/>
         </w:rPr>
         <w:t xml:space="preserve">trash</w:t>
@@ -1170,15 +1201,15 @@
         <w:t xml:space="preserve">icon deactivates a city (it stops future scans but keeps the record).</w:t>
       </w:r>
     </w:p>
+    <w:bookmarkEnd w:id="27"/>
+    <w:bookmarkStart w:id="28" w:name="the-scan-type-indicator"/>
     <w:p>
       <w:pPr>
         <w:pStyle w:val="Heading2"/>
       </w:pPr>
-      <w:bookmarkStart w:id="29" w:name="the-scan-type-indicator"/>
       <w:r>
         <w:t xml:space="preserve">The Scan Type indicator</w:t>
       </w:r>
-      <w:bookmarkEnd w:id="29"/>
     </w:p>
     <w:p>
       <w:pPr>
@@ -1192,6 +1223,7 @@
       </w:r>
       <w:r>
         <w:rPr>
+          <w:bCs/>
           <w:b/>
         </w:rPr>
         <w:t xml:space="preserve">Scan Type</w:t>
@@ -1207,6 +1239,7 @@
       </w:r>
       <w:r>
         <w:rPr>
+          <w:bCs/>
           <w:b/>
         </w:rPr>
         <w:t xml:space="preserve">Direct</w:t>
@@ -1222,6 +1255,7 @@
       </w:r>
       <w:r>
         <w:rPr>
+          <w:bCs/>
           <w:b/>
         </w:rPr>
         <w:t xml:space="preserve">Proxy</w:t>
@@ -1233,15 +1267,16 @@
         <w:t xml:space="preserve">(a residential proxy was used because the site is protected by a web application firewall). This tells you whether a city needed the heavier scan path.</w:t>
       </w:r>
     </w:p>
+    <w:bookmarkEnd w:id="28"/>
+    <w:bookmarkEnd w:id="29"/>
+    <w:bookmarkStart w:id="31" w:name="running-scans"/>
     <w:p>
       <w:pPr>
         <w:pStyle w:val="Heading1"/>
       </w:pPr>
-      <w:bookmarkStart w:id="30" w:name="running-scans"/>
       <w:r>
         <w:t xml:space="preserve">Running Scans</w:t>
       </w:r>
-      <w:bookmarkEnd w:id="30"/>
     </w:p>
     <w:p>
       <w:pPr>
@@ -1255,6 +1290,7 @@
       </w:r>
       <w:r>
         <w:rPr>
+          <w:bCs/>
           <w:b/>
         </w:rPr>
         <w:t xml:space="preserve">Not Assessed</w:t>
@@ -1276,6 +1312,7 @@
       </w:pPr>
       <w:r>
         <w:rPr>
+          <w:bCs/>
           <w:b/>
         </w:rPr>
         <w:t xml:space="preserve">Run Audit</w:t>
@@ -1297,6 +1334,7 @@
       </w:pPr>
       <w:r>
         <w:rPr>
+          <w:bCs/>
           <w:b/>
         </w:rPr>
         <w:t xml:space="preserve">Re-Audit</w:t>
@@ -1312,6 +1350,7 @@
       </w:r>
       <w:r>
         <w:rPr>
+          <w:bCs/>
           <w:b/>
         </w:rPr>
         <w:t xml:space="preserve">Deep Scan</w:t>
@@ -1335,6 +1374,7 @@
       </w:r>
       <w:r>
         <w:rPr>
+          <w:bCs/>
           <w:b/>
         </w:rPr>
         <w:t xml:space="preserve">automatically escalates</w:t>
@@ -1347,6 +1387,7 @@
       </w:r>
       <w:r>
         <w:rPr>
+          <w:bCs/>
           <w:b/>
         </w:rPr>
         <w:t xml:space="preserve">Scan Failed</w:t>
@@ -1388,34 +1429,32 @@
         <w:t xml:space="preserve">”</w:t>
       </w:r>
     </w:p>
+    <w:bookmarkStart w:id="30" w:name="what-the-statuses-mean"/>
     <w:p>
       <w:pPr>
         <w:pStyle w:val="Heading2"/>
       </w:pPr>
-      <w:bookmarkStart w:id="31" w:name="what-the-statuses-mean"/>
       <w:r>
         <w:t xml:space="preserve">What the statuses mean</w:t>
       </w:r>
-      <w:bookmarkEnd w:id="31"/>
     </w:p>
     <w:tbl>
       <w:tblPr>
         <w:tblStyle w:val="Table"/>
-        <w:tblW w:type="pct" w:w="0.0"/>
-        <w:tblLook w:firstRow="1"/>
+        <w:tblW w:type="pct" w:w="5000"/>
+        <w:tblLook w:firstRow="1" w:lastRow="0" w:firstColumn="0" w:lastColumn="0" w:noHBand="0" w:noVBand="0" w:val="0020"/>
+        <w:jc w:val="start"/>
       </w:tblPr>
-      <w:tblGrid/>
+      <w:tblGrid>
+        <w:gridCol w:w="3960"/>
+        <w:gridCol w:w="3960"/>
+      </w:tblGrid>
       <w:tr>
         <w:trPr>
-          <w:cnfStyle w:firstRow="1"/>
+          <w:tblHeader w:val="true"/>
         </w:trPr>
         <w:tc>
-          <w:tcPr>
-            <w:tcBorders>
-              <w:bottom w:val="single"/>
-            </w:tcBorders>
-            <w:vAlign w:val="bottom"/>
-          </w:tcPr>
+          <w:tcPr/>
           <w:p>
             <w:pPr>
               <w:pStyle w:val="Compact"/>
@@ -1427,12 +1466,7 @@
           </w:p>
         </w:tc>
         <w:tc>
-          <w:tcPr>
-            <w:tcBorders>
-              <w:bottom w:val="single"/>
-            </w:tcBorders>
-            <w:vAlign w:val="bottom"/>
-          </w:tcPr>
+          <w:tcPr/>
           <w:p>
             <w:pPr>
               <w:pStyle w:val="Compact"/>
@@ -1446,6 +1480,7 @@
       </w:tr>
       <w:tr>
         <w:tc>
+          <w:tcPr/>
           <w:p>
             <w:pPr>
               <w:pStyle w:val="Compact"/>
@@ -1453,6 +1488,7 @@
             </w:pPr>
             <w:r>
               <w:rPr>
+                <w:bCs/>
                 <w:b/>
               </w:rPr>
               <w:t xml:space="preserve">Not Assessed</w:t>
@@ -1460,6 +1496,7 @@
           </w:p>
         </w:tc>
         <w:tc>
+          <w:tcPr/>
           <w:p>
             <w:pPr>
               <w:pStyle w:val="Compact"/>
@@ -1473,6 +1510,7 @@
       </w:tr>
       <w:tr>
         <w:tc>
+          <w:tcPr/>
           <w:p>
             <w:pPr>
               <w:pStyle w:val="Compact"/>
@@ -1480,6 +1518,7 @@
             </w:pPr>
             <w:r>
               <w:rPr>
+                <w:bCs/>
                 <w:b/>
               </w:rPr>
               <w:t xml:space="preserve">No AI Detected</w:t>
@@ -1487,6 +1526,7 @@
           </w:p>
         </w:tc>
         <w:tc>
+          <w:tcPr/>
           <w:p>
             <w:pPr>
               <w:pStyle w:val="Compact"/>
@@ -1500,6 +1540,7 @@
       </w:tr>
       <w:tr>
         <w:tc>
+          <w:tcPr/>
           <w:p>
             <w:pPr>
               <w:pStyle w:val="Compact"/>
@@ -1507,6 +1548,7 @@
             </w:pPr>
             <w:r>
               <w:rPr>
+                <w:bCs/>
                 <w:b/>
               </w:rPr>
               <w:t xml:space="preserve">In Cure</w:t>
@@ -1514,6 +1556,7 @@
           </w:p>
         </w:tc>
         <w:tc>
+          <w:tcPr/>
           <w:p>
             <w:pPr>
               <w:pStyle w:val="Compact"/>
@@ -1527,6 +1570,7 @@
       </w:tr>
       <w:tr>
         <w:tc>
+          <w:tcPr/>
           <w:p>
             <w:pPr>
               <w:pStyle w:val="Compact"/>
@@ -1534,6 +1578,7 @@
             </w:pPr>
             <w:r>
               <w:rPr>
+                <w:bCs/>
                 <w:b/>
               </w:rPr>
               <w:t xml:space="preserve">Non-Compliant</w:t>
@@ -1541,6 +1586,7 @@
           </w:p>
         </w:tc>
         <w:tc>
+          <w:tcPr/>
           <w:p>
             <w:pPr>
               <w:pStyle w:val="Compact"/>
@@ -1554,6 +1600,7 @@
       </w:tr>
       <w:tr>
         <w:tc>
+          <w:tcPr/>
           <w:p>
             <w:pPr>
               <w:pStyle w:val="Compact"/>
@@ -1561,6 +1608,7 @@
             </w:pPr>
             <w:r>
               <w:rPr>
+                <w:bCs/>
                 <w:b/>
               </w:rPr>
               <w:t xml:space="preserve">Expired</w:t>
@@ -1568,6 +1616,7 @@
           </w:p>
         </w:tc>
         <w:tc>
+          <w:tcPr/>
           <w:p>
             <w:pPr>
               <w:pStyle w:val="Compact"/>
@@ -1581,6 +1630,7 @@
       </w:tr>
       <w:tr>
         <w:tc>
+          <w:tcPr/>
           <w:p>
             <w:pPr>
               <w:pStyle w:val="Compact"/>
@@ -1588,6 +1638,7 @@
             </w:pPr>
             <w:r>
               <w:rPr>
+                <w:bCs/>
                 <w:b/>
               </w:rPr>
               <w:t xml:space="preserve">Review Needed</w:t>
@@ -1595,6 +1646,7 @@
           </w:p>
         </w:tc>
         <w:tc>
+          <w:tcPr/>
           <w:p>
             <w:pPr>
               <w:pStyle w:val="Compact"/>
@@ -1608,6 +1660,7 @@
       </w:tr>
       <w:tr>
         <w:tc>
+          <w:tcPr/>
           <w:p>
             <w:pPr>
               <w:pStyle w:val="Compact"/>
@@ -1615,6 +1668,7 @@
             </w:pPr>
             <w:r>
               <w:rPr>
+                <w:bCs/>
                 <w:b/>
               </w:rPr>
               <w:t xml:space="preserve">Scan Failed</w:t>
@@ -1622,6 +1676,7 @@
           </w:p>
         </w:tc>
         <w:tc>
+          <w:tcPr/>
           <w:p>
             <w:pPr>
               <w:pStyle w:val="Compact"/>
@@ -1634,15 +1689,16 @@
         </w:tc>
       </w:tr>
     </w:tbl>
+    <w:bookmarkEnd w:id="30"/>
+    <w:bookmarkEnd w:id="31"/>
+    <w:bookmarkStart w:id="32" w:name="reading-a-citys-results"/>
     <w:p>
       <w:pPr>
         <w:pStyle w:val="Heading1"/>
       </w:pPr>
-      <w:bookmarkStart w:id="32" w:name="reading-a-citys-results"/>
       <w:r>
         <w:t xml:space="preserve">Reading a City’s Results</w:t>
       </w:r>
-      <w:bookmarkEnd w:id="32"/>
     </w:p>
     <w:p>
       <w:pPr>
@@ -1662,6 +1718,7 @@
       </w:pPr>
       <w:r>
         <w:rPr>
+          <w:bCs/>
           <w:b/>
         </w:rPr>
         <w:t xml:space="preserve">AI Assets Detected</w:t>
@@ -1683,6 +1740,7 @@
       </w:pPr>
       <w:r>
         <w:rPr>
+          <w:bCs/>
           <w:b/>
         </w:rPr>
         <w:t xml:space="preserve">Violations &amp; Cure Period</w:t>
@@ -1704,6 +1762,7 @@
       </w:pPr>
       <w:r>
         <w:rPr>
+          <w:bCs/>
           <w:b/>
         </w:rPr>
         <w:t xml:space="preserve">Cure Period Summary</w:t>
@@ -1725,6 +1784,7 @@
       </w:pPr>
       <w:r>
         <w:rPr>
+          <w:bCs/>
           <w:b/>
         </w:rPr>
         <w:t xml:space="preserve">Violation Breakdown</w:t>
@@ -1744,15 +1804,15 @@
         <w:t xml:space="preserve">Every city page repeats the reminder that findings are candidate signals requiring human and legal review.</w:t>
       </w:r>
     </w:p>
+    <w:bookmarkEnd w:id="32"/>
+    <w:bookmarkStart w:id="33" w:name="the-60-day-cure-clock"/>
     <w:p>
       <w:pPr>
         <w:pStyle w:val="Heading1"/>
       </w:pPr>
-      <w:bookmarkStart w:id="33" w:name="the-60-day-cure-clock"/>
       <w:r>
         <w:t xml:space="preserve">The 60-Day Cure Clock</w:t>
       </w:r>
-      <w:bookmarkEnd w:id="33"/>
     </w:p>
     <w:p>
       <w:pPr>
@@ -1772,6 +1832,7 @@
       </w:pPr>
       <w:r>
         <w:rPr>
+          <w:bCs/>
           <w:b/>
         </w:rPr>
         <w:t xml:space="preserve">The clock starts when the violation is first detected — not when the city was added or last scanned.</w:t>
@@ -1793,6 +1854,7 @@
       </w:pPr>
       <w:r>
         <w:rPr>
+          <w:bCs/>
           <w:b/>
         </w:rPr>
         <w:t xml:space="preserve">The countdown is live.</w:t>
@@ -1808,6 +1870,7 @@
       </w:r>
       <w:r>
         <w:rPr>
+          <w:bCs/>
           <w:b/>
         </w:rPr>
         <w:t xml:space="preserve">Expired</w:t>
@@ -1819,15 +1882,15 @@
         <w:t xml:space="preserve">and is referable to the Texas Attorney General.</w:t>
       </w:r>
     </w:p>
+    <w:bookmarkEnd w:id="33"/>
+    <w:bookmarkStart w:id="37" w:name="getting-proving-compliance"/>
     <w:p>
       <w:pPr>
         <w:pStyle w:val="Heading1"/>
       </w:pPr>
-      <w:bookmarkStart w:id="34" w:name="getting-proving-compliance"/>
       <w:r>
         <w:t xml:space="preserve">Getting &amp; Proving Compliance</w:t>
       </w:r>
-      <w:bookmarkEnd w:id="34"/>
     </w:p>
     <w:p>
       <w:pPr>
@@ -1880,6 +1943,7 @@
       </w:pPr>
       <w:r>
         <w:rPr>
+          <w:bCs/>
           <w:b/>
         </w:rPr>
         <w:t xml:space="preserve">AI Use-Case Inventory</w:t>
@@ -1895,6 +1959,7 @@
       </w:r>
       <w:r>
         <w:rPr>
+          <w:bCs/>
           <w:b/>
         </w:rPr>
         <w:t xml:space="preserve">where it came from</w:t>
@@ -1916,6 +1981,7 @@
       </w:pPr>
       <w:r>
         <w:rPr>
+          <w:bCs/>
           <w:b/>
         </w:rPr>
         <w:t xml:space="preserve">Compliance Report</w:t>
@@ -1937,6 +2003,7 @@
       </w:pPr>
       <w:r>
         <w:rPr>
+          <w:bCs/>
           <w:b/>
         </w:rPr>
         <w:t xml:space="preserve">AI Use Policy</w:t>
@@ -1958,6 +2025,7 @@
       </w:pPr>
       <w:r>
         <w:rPr>
+          <w:bCs/>
           <w:b/>
         </w:rPr>
         <w:t xml:space="preserve">AG Response Pack</w:t>
@@ -1979,26 +2047,119 @@
       </w:pPr>
       <w:r>
         <w:rPr>
-          <w:b/>
-        </w:rPr>
-        <w:t xml:space="preserve">Import Procurement / Sync Staff Usage / Agendas / OAuth</w:t>
-      </w:r>
-      <w:r>
-        <w:t xml:space="preserve"> </w:t>
-      </w:r>
-      <w:r>
-        <w:t xml:space="preserve">— additional discovery inputs that widen the inventory beyond the public website.</w:t>
-      </w:r>
-    </w:p>
+          <w:bCs/>
+          <w:b/>
+        </w:rPr>
+        <w:t xml:space="preserve">Add Data menu</w:t>
+      </w:r>
+      <w:r>
+        <w:t xml:space="preserve"> </w:t>
+      </w:r>
+      <w:r>
+        <w:t xml:space="preserve">— the four additional discovery inputs that widen the inventory beyond the public website now live in one</w:t>
+      </w:r>
+      <w:r>
+        <w:t xml:space="preserve"> </w:t>
+      </w:r>
+      <w:r>
+        <w:rPr>
+          <w:bCs/>
+          <w:b/>
+        </w:rPr>
+        <w:t xml:space="preserve">Add Data</w:t>
+      </w:r>
+      <w:r>
+        <w:t xml:space="preserve"> </w:t>
+      </w:r>
+      <w:r>
+        <w:t xml:space="preserve">dropdown next to</w:t>
+      </w:r>
+      <w:r>
+        <w:t xml:space="preserve"> </w:t>
+      </w:r>
+      <w:r>
+        <w:rPr>
+          <w:iCs/>
+          <w:i/>
+        </w:rPr>
+        <w:t xml:space="preserve">Declare AI System</w:t>
+      </w:r>
+      <w:r>
+        <w:t xml:space="preserve">:</w:t>
+      </w:r>
+      <w:r>
+        <w:t xml:space="preserve"> </w:t>
+      </w:r>
+      <w:r>
+        <w:rPr>
+          <w:bCs/>
+          <w:b/>
+        </w:rPr>
+        <w:t xml:space="preserve">Sync Staff Usage</w:t>
+      </w:r>
+      <w:r>
+        <w:t xml:space="preserve"> </w:t>
+      </w:r>
+      <w:r>
+        <w:t xml:space="preserve">(Sentinel telemetry),</w:t>
+      </w:r>
+      <w:r>
+        <w:t xml:space="preserve"> </w:t>
+      </w:r>
+      <w:r>
+        <w:rPr>
+          <w:bCs/>
+          <w:b/>
+        </w:rPr>
+        <w:t xml:space="preserve">Import Procurement</w:t>
+      </w:r>
+      <w:r>
+        <w:t xml:space="preserve"> </w:t>
+      </w:r>
+      <w:r>
+        <w:t xml:space="preserve">(vendor/spend/contract files),</w:t>
+      </w:r>
+      <w:r>
+        <w:t xml:space="preserve"> </w:t>
+      </w:r>
+      <w:r>
+        <w:rPr>
+          <w:bCs/>
+          <w:b/>
+        </w:rPr>
+        <w:t xml:space="preserve">Scan Agendas</w:t>
+      </w:r>
+      <w:r>
+        <w:t xml:space="preserve"> </w:t>
+      </w:r>
+      <w:r>
+        <w:t xml:space="preserve">(council/EDC agendas), and</w:t>
+      </w:r>
+      <w:r>
+        <w:t xml:space="preserve"> </w:t>
+      </w:r>
+      <w:r>
+        <w:rPr>
+          <w:bCs/>
+          <w:b/>
+        </w:rPr>
+        <w:t xml:space="preserve">OAuth Export</w:t>
+      </w:r>
+      <w:r>
+        <w:t xml:space="preserve"> </w:t>
+      </w:r>
+      <w:r>
+        <w:t xml:space="preserve">(Microsoft Entra / Google Workspace, dry run by default). Same permissions and behavior as the former individual buttons.</w:t>
+      </w:r>
+    </w:p>
+    <w:bookmarkStart w:id="34" w:name="X27965e1a890999c0f5d72c5d69f6c4c1619b6bd"/>
     <w:p>
       <w:pPr>
         <w:pStyle w:val="Heading2"/>
       </w:pPr>
-      <w:bookmarkStart w:id="35" w:name="X27965e1a890999c0f5d72c5d69f6c4c1619b6bd"/>
       <w:r>
         <w:t xml:space="preserve">Knowing where an AI system came from — and whether it is live</w:t>
       </w:r>
-      <w:bookmarkEnd w:id="35"/>
     </w:p>
     <w:p>
       <w:pPr>
@@ -2014,6 +2175,7 @@
       </w:pPr>
       <w:r>
         <w:rPr>
+          <w:bCs/>
           <w:b/>
         </w:rPr>
         <w:t xml:space="preserve">Where it was found</w:t>
@@ -2029,6 +2191,7 @@
       </w:r>
       <w:r>
         <w:rPr>
+          <w:iCs/>
           <w:i/>
         </w:rPr>
         <w:t xml:space="preserve">Website scan</w:t>
@@ -2041,6 +2204,7 @@
       </w:r>
       <w:r>
         <w:rPr>
+          <w:iCs/>
           <w:i/>
         </w:rPr>
         <w:t xml:space="preserve">Council agenda</w:t>
@@ -2053,6 +2217,7 @@
       </w:r>
       <w:r>
         <w:rPr>
+          <w:iCs/>
           <w:i/>
         </w:rPr>
         <w:t xml:space="preserve">Procurement</w:t>
@@ -2065,6 +2230,7 @@
       </w:r>
       <w:r>
         <w:rPr>
+          <w:iCs/>
           <w:i/>
         </w:rPr>
         <w:t xml:space="preserve">Budget</w:t>
@@ -2077,6 +2243,7 @@
       </w:r>
       <w:r>
         <w:rPr>
+          <w:iCs/>
           <w:i/>
         </w:rPr>
         <w:t xml:space="preserve">Staff usage</w:t>
@@ -2089,6 +2256,7 @@
       </w:r>
       <w:r>
         <w:rPr>
+          <w:iCs/>
           <w:i/>
         </w:rPr>
         <w:t xml:space="preserve">Declared</w:t>
@@ -2106,6 +2274,7 @@
       </w:pPr>
       <w:r>
         <w:rPr>
+          <w:bCs/>
           <w:b/>
         </w:rPr>
         <w:t xml:space="preserve">Whether it is deployed:</w:t>
@@ -2121,6 +2290,7 @@
       </w:pPr>
       <w:r>
         <w:rPr>
+          <w:bCs/>
           <w:b/>
         </w:rPr>
         <w:t xml:space="preserve">Live on site</w:t>
@@ -2142,6 +2312,7 @@
       </w:pPr>
       <w:r>
         <w:rPr>
+          <w:bCs/>
           <w:b/>
         </w:rPr>
         <w:t xml:space="preserve">Procured · verify</w:t>
@@ -2157,6 +2328,7 @@
       </w:r>
       <w:r>
         <w:rPr>
+          <w:bCs/>
           <w:b/>
         </w:rPr>
         <w:t xml:space="preserve">Budgeted · verify</w:t>
@@ -2172,6 +2344,7 @@
       </w:r>
       <w:r>
         <w:rPr>
+          <w:iCs/>
           <w:i/>
         </w:rPr>
         <w:t xml:space="preserve">bought or planned</w:t>
@@ -2187,6 +2360,7 @@
       </w:r>
       <w:r>
         <w:rPr>
+          <w:bCs/>
           <w:b/>
         </w:rPr>
         <w:t xml:space="preserve">not</w:t>
@@ -2208,6 +2382,7 @@
       </w:pPr>
       <w:r>
         <w:rPr>
+          <w:bCs/>
           <w:b/>
         </w:rPr>
         <w:t xml:space="preserve">Staff-reported</w:t>
@@ -2229,6 +2404,7 @@
       </w:pPr>
       <w:r>
         <w:rPr>
+          <w:bCs/>
           <w:b/>
         </w:rPr>
         <w:t xml:space="preserve">Self-declared</w:t>
@@ -2248,15 +2424,15 @@
         <w:t xml:space="preserve">This distinction protects you from a false alarm: a tool approved in a January agenda but not launched until June is not a disclosure violation in February. Findings from records never create a violation or start a cure clock — only what is observed live on your website does.</w:t>
       </w:r>
     </w:p>
+    <w:bookmarkEnd w:id="34"/>
+    <w:bookmarkStart w:id="35" w:name="discovering-ai-from-council-agendas"/>
     <w:p>
       <w:pPr>
         <w:pStyle w:val="Heading2"/>
       </w:pPr>
-      <w:bookmarkStart w:id="36" w:name="discovering-ai-from-council-agendas"/>
       <w:r>
         <w:t xml:space="preserve">Discovering AI from council agendas</w:t>
       </w:r>
-      <w:bookmarkEnd w:id="36"/>
     </w:p>
     <w:p>
       <w:pPr>
@@ -2270,6 +2446,7 @@
       </w:r>
       <w:r>
         <w:rPr>
+          <w:bCs/>
           <w:b/>
         </w:rPr>
         <w:t xml:space="preserve">Agendas</w:t>
@@ -2285,6 +2462,7 @@
       </w:r>
       <w:r>
         <w:rPr>
+          <w:iCs/>
           <w:i/>
         </w:rPr>
         <w:t xml:space="preserve">procured (agenda)</w:t>
@@ -2297,6 +2475,7 @@
       </w:r>
       <w:r>
         <w:rPr>
+          <w:bCs/>
           <w:b/>
         </w:rPr>
         <w:t xml:space="preserve">You only need to enter the Legistar slug once per city</w:t>
@@ -2320,6 +2499,7 @@
       </w:r>
       <w:r>
         <w:rPr>
+          <w:bCs/>
           <w:b/>
         </w:rPr>
         <w:t xml:space="preserve">which extractor read them</w:t>
@@ -2338,6 +2518,7 @@
       </w:pPr>
       <w:r>
         <w:rPr>
+          <w:bCs/>
           <w:b/>
         </w:rPr>
         <w:t xml:space="preserve">Extracted via Vertex (Gemini)</w:t>
@@ -2377,6 +2558,7 @@
       </w:pPr>
       <w:r>
         <w:rPr>
+          <w:bCs/>
           <w:b/>
         </w:rPr>
         <w:t xml:space="preserve">Vertex (Gemini) — some items used keyword fallback</w:t>
@@ -2398,6 +2580,7 @@
       </w:pPr>
       <w:r>
         <w:rPr>
+          <w:bCs/>
           <w:b/>
         </w:rPr>
         <w:t xml:space="preserve">Vertex unavailable — keyword fallback used</w:t>
@@ -2419,6 +2602,7 @@
       </w:pPr>
       <w:r>
         <w:rPr>
+          <w:bCs/>
           <w:b/>
         </w:rPr>
         <w:t xml:space="preserve">Keyword extractor (no LLM)</w:t>
@@ -2492,15 +2676,15 @@
         <w:t xml:space="preserve">— no server logs required.</w:t>
       </w:r>
     </w:p>
+    <w:bookmarkEnd w:id="35"/>
+    <w:bookmarkStart w:id="36" w:name="Xc4ed773a6e1f6d8a6d7ac0e65bd377ed356aa7f"/>
     <w:p>
       <w:pPr>
         <w:pStyle w:val="Heading2"/>
       </w:pPr>
-      <w:bookmarkStart w:id="37" w:name="Xc4ed773a6e1f6d8a6d7ac0e65bd377ed356aa7f"/>
       <w:r>
         <w:t xml:space="preserve">Discovering shadow AI your staff signed up for (OAuth)</w:t>
       </w:r>
-      <w:bookmarkEnd w:id="37"/>
     </w:p>
     <w:p>
       <w:pPr>
@@ -2520,6 +2704,7 @@
       </w:r>
       <w:r>
         <w:rPr>
+          <w:bCs/>
           <w:b/>
         </w:rPr>
         <w:t xml:space="preserve">OAuth</w:t>
@@ -2537,6 +2722,7 @@
       </w:pPr>
       <w:r>
         <w:rPr>
+          <w:bCs/>
           <w:b/>
         </w:rPr>
         <w:t xml:space="preserve">Nothing is connected to your tenant, and we are given no access.</w:t>
@@ -2578,6 +2764,7 @@
       </w:r>
       <w:r>
         <w:rPr>
+          <w:bCs/>
           <w:b/>
         </w:rPr>
         <w:t xml:space="preserve">Microsoft 365</w:t>
@@ -2593,6 +2780,7 @@
       </w:r>
       <w:r>
         <w:rPr>
+          <w:bCs/>
           <w:b/>
         </w:rPr>
         <w:t xml:space="preserve">Google Workspace</w:t>
@@ -2620,6 +2808,7 @@
       </w:pPr>
       <w:r>
         <w:rPr>
+          <w:bCs/>
           <w:b/>
         </w:rPr>
         <w:t xml:space="preserve">Run the script.</w:t>
@@ -2653,6 +2842,7 @@
       </w:pPr>
       <w:r>
         <w:rPr>
+          <w:bCs/>
           <w:b/>
         </w:rPr>
         <w:t xml:space="preserve">Browser only (Microsoft 365).</w:t>
@@ -2668,6 +2858,7 @@
       </w:r>
       <w:r>
         <w:rPr>
+          <w:bCs/>
           <w:b/>
         </w:rPr>
         <w:t xml:space="preserve">Microsoft Graph Explorer</w:t>
@@ -2689,18 +2880,21 @@
       </w:r>
       <w:r>
         <w:rPr>
+          <w:bCs/>
           <w:b/>
         </w:rPr>
         <w:t xml:space="preserve">Nothing installs and</w:t>
       </w:r>
       <w:r>
         <w:rPr>
-          <w:b/>
-        </w:rPr>
-        <w:t xml:space="preserve"> </w:t>
-      </w:r>
-      <w:r>
-        <w:rPr>
+          <w:bCs/>
+          <w:b/>
+        </w:rPr>
+        <w:t xml:space="preserve"> </w:t>
+      </w:r>
+      <w:r>
+        <w:rPr>
+          <w:bCs/>
           <w:b/>
         </w:rPr>
         <w:t xml:space="preserve">nothing runs on any machine.</w:t>
@@ -2728,6 +2922,7 @@
       </w:pPr>
       <w:r>
         <w:rPr>
+          <w:bCs/>
           <w:b/>
         </w:rPr>
         <w:t xml:space="preserve">Google Workspace.</w:t>
@@ -2743,18 +2938,21 @@
       </w:r>
       <w:r>
         <w:rPr>
+          <w:bCs/>
           <w:b/>
         </w:rPr>
         <w:t xml:space="preserve">Security →</w:t>
       </w:r>
       <w:r>
         <w:rPr>
-          <w:b/>
-        </w:rPr>
-        <w:t xml:space="preserve"> </w:t>
-      </w:r>
-      <w:r>
-        <w:rPr>
+          <w:bCs/>
+          <w:b/>
+        </w:rPr>
+        <w:t xml:space="preserve"> </w:t>
+      </w:r>
+      <w:r>
+        <w:rPr>
+          <w:bCs/>
           <w:b/>
         </w:rPr>
         <w:t xml:space="preserve">Access and data control → API controls → App access control</w:t>
@@ -2767,6 +2965,7 @@
       </w:r>
       <w:r>
         <w:rPr>
+          <w:bCs/>
           <w:b/>
         </w:rPr>
         <w:t xml:space="preserve">Accessed apps</w:t>
@@ -2782,6 +2981,7 @@
       </w:r>
       <w:r>
         <w:rPr>
+          <w:bCs/>
           <w:b/>
         </w:rPr>
         <w:t xml:space="preserve">Download list</w:t>
@@ -2831,6 +3031,7 @@
       </w:r>
       <w:r>
         <w:rPr>
+          <w:bCs/>
           <w:b/>
         </w:rPr>
         <w:t xml:space="preserve">Read it before you upload it.</w:t>
@@ -2846,6 +3047,7 @@
       </w:r>
       <w:r>
         <w:rPr>
+          <w:bCs/>
           <w:b/>
         </w:rPr>
         <w:t xml:space="preserve">AI Inventory → OAuth</w:t>
@@ -2884,6 +3086,7 @@
       </w:pPr>
       <w:r>
         <w:rPr>
+          <w:bCs/>
           <w:b/>
         </w:rPr>
         <w:t xml:space="preserve">Dry run.</w:t>
@@ -2899,6 +3102,7 @@
       </w:r>
       <w:r>
         <w:rPr>
+          <w:bCs/>
           <w:b/>
         </w:rPr>
         <w:t xml:space="preserve">nothing</w:t>
@@ -2929,6 +3133,7 @@
       </w:pPr>
       <w:r>
         <w:rPr>
+          <w:bCs/>
           <w:b/>
         </w:rPr>
         <w:t xml:space="preserve">No employee names.</w:t>
@@ -2944,6 +3149,7 @@
       </w:r>
       <w:r>
         <w:rPr>
+          <w:iCs/>
           <w:i/>
         </w:rPr>
         <w:t xml:space="preserve">number</w:t>
@@ -2979,6 +3185,7 @@
       </w:r>
       <w:r>
         <w:rPr>
+          <w:bCs/>
           <w:b/>
         </w:rPr>
         <w:t xml:space="preserve">Procured · verify</w:t>
@@ -3020,6 +3227,7 @@
       </w:pPr>
       <w:r>
         <w:rPr>
+          <w:bCs/>
           <w:b/>
         </w:rPr>
         <w:t xml:space="preserve">Tenant-wide</w:t>
@@ -3035,6 +3243,7 @@
       </w:r>
       <w:r>
         <w:rPr>
+          <w:iCs/>
           <w:i/>
         </w:rPr>
         <w:t xml:space="preserve">entire</w:t>
@@ -3062,6 +3271,7 @@
       </w:pPr>
       <w:r>
         <w:rPr>
+          <w:bCs/>
           <w:b/>
         </w:rPr>
         <w:t xml:space="preserve">Applications we did not recognise</w:t>
@@ -3083,6 +3293,7 @@
       </w:r>
       <w:r>
         <w:rPr>
+          <w:bCs/>
           <w:b/>
         </w:rPr>
         <w:t xml:space="preserve">not findings</w:t>
@@ -3101,6 +3312,7 @@
       </w:r>
       <w:r>
         <w:rPr>
+          <w:bCs/>
           <w:b/>
         </w:rPr>
         <w:t xml:space="preserve">Download for signature review</w:t>
@@ -3122,6 +3334,7 @@
       </w:r>
       <w:r>
         <w:rPr>
+          <w:iCs/>
           <w:i/>
         </w:rPr>
         <w:t xml:space="preserve">every</w:t>
@@ -3157,6 +3370,7 @@
       </w:r>
       <w:r>
         <w:rPr>
+          <w:bCs/>
           <w:b/>
         </w:rPr>
         <w:t xml:space="preserve">Settings → Feature Flags</w:t>
@@ -3165,15 +3379,16 @@
         <w:t xml:space="preserve">.</w:t>
       </w:r>
     </w:p>
+    <w:bookmarkEnd w:id="36"/>
+    <w:bookmarkEnd w:id="37"/>
+    <w:bookmarkStart w:id="42" w:name="safe-harbor-readiness-framework-lenses"/>
     <w:p>
       <w:pPr>
         <w:pStyle w:val="Heading1"/>
       </w:pPr>
-      <w:bookmarkStart w:id="38" w:name="safe-harbor-readiness-framework-lenses"/>
       <w:r>
         <w:t xml:space="preserve">Safe Harbor Readiness &amp; Framework Lenses</w:t>
       </w:r>
-      <w:bookmarkEnd w:id="38"/>
     </w:p>
     <w:p>
       <w:pPr>
@@ -3187,6 +3402,7 @@
       </w:r>
       <w:r>
         <w:rPr>
+          <w:bCs/>
           <w:b/>
         </w:rPr>
         <w:t xml:space="preserve">TRAIGA Safe Harbor Readiness</w:t>
@@ -3202,6 +3418,7 @@
       </w:r>
       <w:r>
         <w:rPr>
+          <w:bCs/>
           <w:b/>
         </w:rPr>
         <w:t xml:space="preserve">Municipal AI Profile</w:t>
@@ -3217,6 +3434,7 @@
       </w:r>
       <w:r>
         <w:rPr>
+          <w:bCs/>
           <w:b/>
         </w:rPr>
         <w:t xml:space="preserve">NIST AI Risk Management Framework</w:t>
@@ -3232,6 +3450,7 @@
       </w:r>
       <w:r>
         <w:rPr>
+          <w:bCs/>
           <w:b/>
         </w:rPr>
         <w:t xml:space="preserve">Tex. Bus. &amp; Com. Code § 552.105(c)–(e)</w:t>
@@ -3240,15 +3459,14 @@
         <w:t xml:space="preserve">.</w:t>
       </w:r>
     </w:p>
+    <w:bookmarkStart w:id="38" w:name="the-four-functions"/>
     <w:p>
       <w:pPr>
         <w:pStyle w:val="Heading2"/>
       </w:pPr>
-      <w:bookmarkStart w:id="39" w:name="the-four-functions"/>
       <w:r>
         <w:t xml:space="preserve">The four functions</w:t>
       </w:r>
-      <w:bookmarkEnd w:id="39"/>
     </w:p>
     <w:p>
       <w:pPr>
@@ -3262,6 +3480,7 @@
       </w:r>
       <w:r>
         <w:rPr>
+          <w:bCs/>
           <w:b/>
         </w:rPr>
         <w:t xml:space="preserve">GOVERN, MAP, MEASURE, MANAGE</w:t>
@@ -3273,15 +3492,15 @@
         <w:t xml:space="preserve">— each shown as a ring with a satisfied/total count.</w:t>
       </w:r>
     </w:p>
+    <w:bookmarkEnd w:id="38"/>
+    <w:bookmarkStart w:id="39" w:name="machine-verified-vs.-attested-controls"/>
     <w:p>
       <w:pPr>
         <w:pStyle w:val="Heading2"/>
       </w:pPr>
-      <w:bookmarkStart w:id="40" w:name="machine-verified-vs.-attested-controls"/>
       <w:r>
         <w:t xml:space="preserve">Machine-verified vs. attested controls</w:t>
       </w:r>
-      <w:bookmarkEnd w:id="40"/>
     </w:p>
     <w:p>
       <w:pPr>
@@ -3293,6 +3512,7 @@
       </w:pPr>
       <w:r>
         <w:rPr>
+          <w:bCs/>
           <w:b/>
         </w:rPr>
         <w:t xml:space="preserve">Machine-verified</w:t>
@@ -3368,6 +3588,7 @@
       </w:pPr>
       <w:r>
         <w:rPr>
+          <w:bCs/>
           <w:b/>
         </w:rPr>
         <w:t xml:space="preserve">Attested</w:t>
@@ -3398,6 +3619,7 @@
       </w:r>
       <w:r>
         <w:rPr>
+          <w:bCs/>
           <w:b/>
         </w:rPr>
         <w:t xml:space="preserve">Attest</w:t>
@@ -3413,6 +3635,7 @@
       </w:r>
       <w:r>
         <w:rPr>
+          <w:bCs/>
           <w:b/>
         </w:rPr>
         <w:t xml:space="preserve">Clear</w:t>
@@ -3424,15 +3647,15 @@
         <w:t xml:space="preserve">to remove an attestation.</w:t>
       </w:r>
     </w:p>
+    <w:bookmarkEnd w:id="39"/>
+    <w:bookmarkStart w:id="40" w:name="framework-lenses-nist-iso-42001"/>
     <w:p>
       <w:pPr>
         <w:pStyle w:val="Heading2"/>
       </w:pPr>
-      <w:bookmarkStart w:id="41" w:name="framework-lenses-nist-iso-42001"/>
       <w:r>
         <w:t xml:space="preserve">Framework lenses (NIST / ISO 42001)</w:t>
       </w:r>
-      <w:bookmarkEnd w:id="41"/>
     </w:p>
     <w:p>
       <w:pPr>
@@ -3446,6 +3669,7 @@
       </w:r>
       <w:r>
         <w:rPr>
+          <w:bCs/>
           <w:b/>
         </w:rPr>
         <w:t xml:space="preserve">Framework lens</w:t>
@@ -3461,6 +3685,7 @@
       </w:r>
       <w:r>
         <w:rPr>
+          <w:bCs/>
           <w:b/>
         </w:rPr>
         <w:t xml:space="preserve">overlap grade</w:t>
@@ -3476,6 +3701,7 @@
       </w:r>
       <w:r>
         <w:rPr>
+          <w:iCs/>
           <w:i/>
         </w:rPr>
         <w:t xml:space="preserve">strong</w:t>
@@ -3488,6 +3714,7 @@
       </w:r>
       <w:r>
         <w:rPr>
+          <w:iCs/>
           <w:i/>
         </w:rPr>
         <w:t xml:space="preserve">partial</w:t>
@@ -3500,6 +3727,7 @@
       </w:r>
       <w:r>
         <w:rPr>
+          <w:iCs/>
           <w:i/>
         </w:rPr>
         <w:t xml:space="preserve">weak</w:t>
@@ -3523,15 +3751,15 @@
         <w:t xml:space="preserve">). Crosswalk mappings are a positioning aid, not legal advice.</w:t>
       </w:r>
     </w:p>
+    <w:bookmarkEnd w:id="40"/>
+    <w:bookmarkStart w:id="41" w:name="alignment-statement"/>
     <w:p>
       <w:pPr>
         <w:pStyle w:val="Heading2"/>
       </w:pPr>
-      <w:bookmarkStart w:id="42" w:name="alignment-statement"/>
       <w:r>
         <w:t xml:space="preserve">Alignment Statement</w:t>
       </w:r>
-      <w:bookmarkEnd w:id="42"/>
     </w:p>
     <w:p>
       <w:pPr>
@@ -3539,6 +3767,7 @@
       </w:pPr>
       <w:r>
         <w:rPr>
+          <w:bCs/>
           <w:b/>
         </w:rPr>
         <w:t xml:space="preserve">Alignment Statement</w:t>
@@ -3550,15 +3779,16 @@
         <w:t xml:space="preserve">generates a Word document summarizing the city’s readiness for the safe-harbor defense. It requires counsel review — the document says so itself.</w:t>
       </w:r>
     </w:p>
+    <w:bookmarkEnd w:id="41"/>
+    <w:bookmarkEnd w:id="42"/>
+    <w:bookmarkStart w:id="43" w:name="settings"/>
     <w:p>
       <w:pPr>
         <w:pStyle w:val="Heading1"/>
       </w:pPr>
-      <w:bookmarkStart w:id="43" w:name="settings"/>
       <w:r>
         <w:t xml:space="preserve">Settings</w:t>
       </w:r>
-      <w:bookmarkEnd w:id="43"/>
     </w:p>
     <w:p>
       <w:pPr>
@@ -3570,6 +3800,7 @@
       </w:pPr>
       <w:r>
         <w:rPr>
+          <w:bCs/>
           <w:b/>
         </w:rPr>
         <w:t xml:space="preserve">Appearance</w:t>
@@ -3591,6 +3822,7 @@
       </w:pPr>
       <w:r>
         <w:rPr>
+          <w:bCs/>
           <w:b/>
         </w:rPr>
         <w:t xml:space="preserve">Feature Flags</w:t>
@@ -3612,6 +3844,7 @@
       </w:pPr>
       <w:r>
         <w:rPr>
+          <w:bCs/>
           <w:b/>
         </w:rPr>
         <w:t xml:space="preserve">Version &amp; Build</w:t>
@@ -3633,6 +3866,7 @@
       </w:pPr>
       <w:r>
         <w:rPr>
+          <w:bCs/>
           <w:b/>
         </w:rPr>
         <w:t xml:space="preserve">Storage / Backend API / Integrations / Deployment</w:t>
@@ -3654,6 +3888,7 @@
       </w:pPr>
       <w:r>
         <w:rPr>
+          <w:bCs/>
           <w:b/>
         </w:rPr>
         <w:t xml:space="preserve">API Health Check</w:t>
@@ -3665,15 +3900,15 @@
         <w:t xml:space="preserve">— confirms the app can reach its backend.</w:t>
       </w:r>
     </w:p>
+    <w:bookmarkEnd w:id="43"/>
+    <w:bookmarkStart w:id="44" w:name="audit-log-error-log"/>
     <w:p>
       <w:pPr>
         <w:pStyle w:val="Heading1"/>
       </w:pPr>
-      <w:bookmarkStart w:id="44" w:name="audit-log-error-log"/>
       <w:r>
         <w:t xml:space="preserve">Audit Log &amp; Error Log</w:t>
       </w:r>
-      <w:bookmarkEnd w:id="44"/>
     </w:p>
     <w:p>
       <w:pPr>
@@ -3685,6 +3920,7 @@
       </w:pPr>
       <w:r>
         <w:rPr>
+          <w:bCs/>
           <w:b/>
         </w:rPr>
         <w:t xml:space="preserve">Audit Log</w:t>
@@ -3706,6 +3942,7 @@
       </w:pPr>
       <w:r>
         <w:rPr>
+          <w:bCs/>
           <w:b/>
         </w:rPr>
         <w:t xml:space="preserve">Error Log</w:t>
@@ -3717,15 +3954,15 @@
         <w:t xml:space="preserve">(platform admin) surfaces operational failures across scans, the scheduler, and deep scans, so problems are visible rather than silent.</w:t>
       </w:r>
     </w:p>
+    <w:bookmarkEnd w:id="44"/>
+    <w:bookmarkStart w:id="45" w:name="sentinel-dlp"/>
     <w:p>
       <w:pPr>
         <w:pStyle w:val="Heading1"/>
       </w:pPr>
-      <w:bookmarkStart w:id="45" w:name="sentinel-dlp"/>
       <w:r>
         <w:t xml:space="preserve">Sentinel (DLP)</w:t>
       </w:r>
-      <w:bookmarkEnd w:id="45"/>
     </w:p>
     <w:p>
       <w:pPr>
@@ -3735,21 +3972,22 @@
         <w:t xml:space="preserve">Sentinel is an optional module that gives the city visibility into staff use of AI tools with city data via lightweight browser telemetry (metadata only). It complements the website scan by covering AI that employees use directly.</w:t>
       </w:r>
     </w:p>
+    <w:bookmarkEnd w:id="45"/>
+    <w:bookmarkStart w:id="46" w:name="glossary"/>
     <w:p>
       <w:pPr>
         <w:pStyle w:val="Heading1"/>
       </w:pPr>
-      <w:bookmarkStart w:id="46" w:name="glossary"/>
       <w:r>
         <w:t xml:space="preserve">Glossary</w:t>
       </w:r>
-      <w:bookmarkEnd w:id="46"/>
     </w:p>
     <w:tbl>
       <w:tblPr>
         <w:tblStyle w:val="Table"/>
-        <w:tblW w:type="pct" w:w="5000.0"/>
-        <w:tblLook w:firstRow="1"/>
+        <w:tblW w:type="pct" w:w="5000"/>
+        <w:tblLook w:firstRow="1" w:lastRow="0" w:firstColumn="0" w:lastColumn="0" w:noHBand="0" w:noVBand="0" w:val="0020"/>
+        <w:jc w:val="start"/>
       </w:tblPr>
       <w:tblGrid>
         <w:gridCol w:w="3960"/>
@@ -3757,15 +3995,10 @@
       </w:tblGrid>
       <w:tr>
         <w:trPr>
-          <w:cnfStyle w:firstRow="1"/>
+          <w:tblHeader w:val="true"/>
         </w:trPr>
         <w:tc>
-          <w:tcPr>
-            <w:tcBorders>
-              <w:bottom w:val="single"/>
-            </w:tcBorders>
-            <w:vAlign w:val="bottom"/>
-          </w:tcPr>
+          <w:tcPr/>
           <w:p>
             <w:pPr>
               <w:pStyle w:val="Compact"/>
@@ -3777,12 +4010,7 @@
           </w:p>
         </w:tc>
         <w:tc>
-          <w:tcPr>
-            <w:tcBorders>
-              <w:bottom w:val="single"/>
-            </w:tcBorders>
-            <w:vAlign w:val="bottom"/>
-          </w:tcPr>
+          <w:tcPr/>
           <w:p>
             <w:pPr>
               <w:pStyle w:val="Compact"/>
@@ -3796,6 +4024,7 @@
       </w:tr>
       <w:tr>
         <w:tc>
+          <w:tcPr/>
           <w:p>
             <w:pPr>
               <w:pStyle w:val="Compact"/>
@@ -3803,6 +4032,7 @@
             </w:pPr>
             <w:r>
               <w:rPr>
+                <w:bCs/>
                 <w:b/>
               </w:rPr>
               <w:t xml:space="preserve">TRAIGA / HB 149</w:t>
@@ -3810,6 +4040,7 @@
           </w:p>
         </w:tc>
         <w:tc>
+          <w:tcPr/>
           <w:p>
             <w:pPr>
               <w:pStyle w:val="Compact"/>
@@ -3823,6 +4054,7 @@
       </w:tr>
       <w:tr>
         <w:tc>
+          <w:tcPr/>
           <w:p>
             <w:pPr>
               <w:pStyle w:val="Compact"/>
@@ -3830,6 +4062,7 @@
             </w:pPr>
             <w:r>
               <w:rPr>
+                <w:bCs/>
                 <w:b/>
               </w:rPr>
               <w:t xml:space="preserve">Ch. 552</w:t>
@@ -3837,6 +4070,7 @@
           </w:p>
         </w:tc>
         <w:tc>
+          <w:tcPr/>
           <w:p>
             <w:pPr>
               <w:pStyle w:val="Compact"/>
@@ -3850,6 +4084,7 @@
       </w:tr>
       <w:tr>
         <w:tc>
+          <w:tcPr/>
           <w:p>
             <w:pPr>
               <w:pStyle w:val="Compact"/>
@@ -3857,6 +4092,7 @@
             </w:pPr>
             <w:r>
               <w:rPr>
+                <w:bCs/>
                 <w:b/>
               </w:rPr>
               <w:t xml:space="preserve">Disclosure</w:t>
@@ -3864,6 +4100,7 @@
           </w:p>
         </w:tc>
         <w:tc>
+          <w:tcPr/>
           <w:p>
             <w:pPr>
               <w:pStyle w:val="Compact"/>
@@ -3877,6 +4114,7 @@
       </w:tr>
       <w:tr>
         <w:tc>
+          <w:tcPr/>
           <w:p>
             <w:pPr>
               <w:pStyle w:val="Compact"/>
@@ -3884,6 +4122,7 @@
             </w:pPr>
             <w:r>
               <w:rPr>
+                <w:bCs/>
                 <w:b/>
               </w:rPr>
               <w:t xml:space="preserve">Cure period</w:t>
@@ -3891,6 +4130,7 @@
           </w:p>
         </w:tc>
         <w:tc>
+          <w:tcPr/>
           <w:p>
             <w:pPr>
               <w:pStyle w:val="Compact"/>
@@ -3904,6 +4144,7 @@
       </w:tr>
       <w:tr>
         <w:tc>
+          <w:tcPr/>
           <w:p>
             <w:pPr>
               <w:pStyle w:val="Compact"/>
@@ -3911,6 +4152,7 @@
             </w:pPr>
             <w:r>
               <w:rPr>
+                <w:bCs/>
                 <w:b/>
               </w:rPr>
               <w:t xml:space="preserve">Safe harbor</w:t>
@@ -3918,6 +4160,7 @@
           </w:p>
         </w:tc>
         <w:tc>
+          <w:tcPr/>
           <w:p>
             <w:pPr>
               <w:pStyle w:val="Compact"/>
@@ -3931,6 +4174,7 @@
       </w:tr>
       <w:tr>
         <w:tc>
+          <w:tcPr/>
           <w:p>
             <w:pPr>
               <w:pStyle w:val="Compact"/>
@@ -3938,6 +4182,7 @@
             </w:pPr>
             <w:r>
               <w:rPr>
+                <w:bCs/>
                 <w:b/>
               </w:rPr>
               <w:t xml:space="preserve">Candidate signal</w:t>
@@ -3945,6 +4190,7 @@
           </w:p>
         </w:tc>
         <w:tc>
+          <w:tcPr/>
           <w:p>
             <w:pPr>
               <w:pStyle w:val="Compact"/>
@@ -3958,6 +4204,7 @@
       </w:tr>
       <w:tr>
         <w:tc>
+          <w:tcPr/>
           <w:p>
             <w:pPr>
               <w:pStyle w:val="Compact"/>
@@ -3965,6 +4212,7 @@
             </w:pPr>
             <w:r>
               <w:rPr>
+                <w:bCs/>
                 <w:b/>
               </w:rPr>
               <w:t xml:space="preserve">NIST AI RMF</w:t>
@@ -3972,6 +4220,7 @@
           </w:p>
         </w:tc>
         <w:tc>
+          <w:tcPr/>
           <w:p>
             <w:pPr>
               <w:pStyle w:val="Compact"/>
@@ -3985,6 +4234,7 @@
       </w:tr>
       <w:tr>
         <w:tc>
+          <w:tcPr/>
           <w:p>
             <w:pPr>
               <w:pStyle w:val="Compact"/>
@@ -3992,6 +4242,7 @@
             </w:pPr>
             <w:r>
               <w:rPr>
+                <w:bCs/>
                 <w:b/>
               </w:rPr>
               <w:t xml:space="preserve">ISO/IEC 42001</w:t>
@@ -3999,6 +4250,7 @@
           </w:p>
         </w:tc>
         <w:tc>
+          <w:tcPr/>
           <w:p>
             <w:pPr>
               <w:pStyle w:val="Compact"/>
@@ -4012,6 +4264,7 @@
       </w:tr>
       <w:tr>
         <w:tc>
+          <w:tcPr/>
           <w:p>
             <w:pPr>
               <w:pStyle w:val="Compact"/>
@@ -4019,6 +4272,7 @@
             </w:pPr>
             <w:r>
               <w:rPr>
+                <w:bCs/>
                 <w:b/>
               </w:rPr>
               <w:t xml:space="preserve">WAF</w:t>
@@ -4026,6 +4280,7 @@
           </w:p>
         </w:tc>
         <w:tc>
+          <w:tcPr/>
           <w:p>
             <w:pPr>
               <w:pStyle w:val="Compact"/>
@@ -4039,6 +4294,7 @@
       </w:tr>
       <w:tr>
         <w:tc>
+          <w:tcPr/>
           <w:p>
             <w:pPr>
               <w:pStyle w:val="Compact"/>
@@ -4046,6 +4302,7 @@
             </w:pPr>
             <w:r>
               <w:rPr>
+                <w:bCs/>
                 <w:b/>
               </w:rPr>
               <w:t xml:space="preserve">Residential / render tier</w:t>
@@ -4053,6 +4310,7 @@
           </w:p>
         </w:tc>
         <w:tc>
+          <w:tcPr/>
           <w:p>
             <w:pPr>
               <w:pStyle w:val="Compact"/>
@@ -4066,6 +4324,7 @@
       </w:tr>
       <w:tr>
         <w:tc>
+          <w:tcPr/>
           <w:p>
             <w:pPr>
               <w:pStyle w:val="Compact"/>
@@ -4073,6 +4332,7 @@
             </w:pPr>
             <w:r>
               <w:rPr>
+                <w:bCs/>
                 <w:b/>
               </w:rPr>
               <w:t xml:space="preserve">Attestation</w:t>
@@ -4080,6 +4340,7 @@
           </w:p>
         </w:tc>
         <w:tc>
+          <w:tcPr/>
           <w:p>
             <w:pPr>
               <w:pStyle w:val="Compact"/>
@@ -4093,6 +4354,7 @@
       </w:tr>
       <w:tr>
         <w:tc>
+          <w:tcPr/>
           <w:p>
             <w:pPr>
               <w:pStyle w:val="Compact"/>
@@ -4100,6 +4362,7 @@
             </w:pPr>
             <w:r>
               <w:rPr>
+                <w:bCs/>
                 <w:b/>
               </w:rPr>
               <w:t xml:space="preserve">Alignment Statement</w:t>
@@ -4107,6 +4370,7 @@
           </w:p>
         </w:tc>
         <w:tc>
+          <w:tcPr/>
           <w:p>
             <w:pPr>
               <w:pStyle w:val="Compact"/>
@@ -4119,15 +4383,15 @@
         </w:tc>
       </w:tr>
     </w:tbl>
+    <w:bookmarkEnd w:id="46"/>
+    <w:bookmarkStart w:id="47" w:name="important-disclaimers"/>
     <w:p>
       <w:pPr>
         <w:pStyle w:val="Heading1"/>
       </w:pPr>
-      <w:bookmarkStart w:id="47" w:name="important-disclaimers"/>
       <w:r>
         <w:t xml:space="preserve">Important Disclaimers</w:t>
       </w:r>
-      <w:bookmarkEnd w:id="47"/>
     </w:p>
     <w:p>
       <w:pPr>
@@ -4137,6 +4401,7 @@
         <w:t xml:space="preserve">TRAIGA Auditor is a governance and monitoring tool, not a substitute for legal counsel. Findings are candidate compliance signals derived from externally observable evidence and require human and legal review before any enforcement, representation, or public statement. Statutory citations reference Texas HB 149 / Tex. Bus. &amp; Com. Code Ch. 552; re-validate against the enrolled bill. Framework crosswalks (NIST, ISO/IEC 42001, and others) are design and positioning aids and are not legal advice. Generated documents, including the Alignment Statement and Compliance Report, require review by qualified counsel before use.</w:t>
       </w:r>
     </w:p>
+    <w:bookmarkEnd w:id="47"/>
     <w:sectPr/>
   </w:body>
 </w:document>
@@ -4168,17 +4433,14 @@
 <file path=word/numbering.xml><?xml version="1.0" encoding="utf-8"?>
 <w:numbering xmlns:w="http://schemas.openxmlformats.org/wordprocessingml/2006/main">
   <w:abstractNum w:abstractNumId="990">
-    <w:nsid w:val="2c1ae401"/>
+    <w:nsid w:val="A990"/>
     <w:multiLevelType w:val="multilevel"/>
     <w:lvl w:ilvl="0">
       <w:numFmt w:val="bullet"/>
       <w:lvlText w:val=" "/>
       <w:lvlJc w:val="left"/>
       <w:pPr>
-        <w:tabs>
-          <w:tab w:val="num" w:pos="0"/>
-        </w:tabs>
-        <w:ind w:left="480" w:hanging="480"/>
+        <w:ind w:left="720" w:hanging="480"/>
       </w:pPr>
     </w:lvl>
     <w:lvl w:ilvl="1">
@@ -4186,10 +4448,7 @@
       <w:lvlText w:val=" "/>
       <w:lvlJc w:val="left"/>
       <w:pPr>
-        <w:tabs>
-          <w:tab w:val="num" w:pos="720"/>
-        </w:tabs>
-        <w:ind w:left="1200" w:hanging="480"/>
+        <w:ind w:left="1440" w:hanging="480"/>
       </w:pPr>
     </w:lvl>
     <w:lvl w:ilvl="2">
@@ -4197,10 +4456,7 @@
       <w:lvlText w:val=" "/>
       <w:lvlJc w:val="left"/>
       <w:pPr>
-        <w:tabs>
-          <w:tab w:val="num" w:pos="1440"/>
-        </w:tabs>
-        <w:ind w:left="1920" w:hanging="480"/>
+        <w:ind w:left="2160" w:hanging="480"/>
       </w:pPr>
     </w:lvl>
     <w:lvl w:ilvl="3">
@@ -4208,10 +4464,7 @@
       <w:lvlText w:val=" "/>
       <w:lvlJc w:val="left"/>
       <w:pPr>
-        <w:tabs>
-          <w:tab w:val="num" w:pos="2160"/>
-        </w:tabs>
-        <w:ind w:left="2640" w:hanging="480"/>
+        <w:ind w:left="2880" w:hanging="480"/>
       </w:pPr>
     </w:lvl>
     <w:lvl w:ilvl="4">
@@ -4219,10 +4472,7 @@
       <w:lvlText w:val=" "/>
       <w:lvlJc w:val="left"/>
       <w:pPr>
-        <w:tabs>
-          <w:tab w:val="num" w:pos="2880"/>
-        </w:tabs>
-        <w:ind w:left="3360" w:hanging="480"/>
+        <w:ind w:left="3600" w:hanging="480"/>
       </w:pPr>
     </w:lvl>
     <w:lvl w:ilvl="5">
@@ -4230,10 +4480,7 @@
       <w:lvlText w:val=" "/>
       <w:lvlJc w:val="left"/>
       <w:pPr>
-        <w:tabs>
-          <w:tab w:val="num" w:pos="3600"/>
-        </w:tabs>
-        <w:ind w:left="4080" w:hanging="480"/>
+        <w:ind w:left="4320" w:hanging="480"/>
       </w:pPr>
     </w:lvl>
     <w:lvl w:ilvl="6">
@@ -4241,10 +4488,7 @@
       <w:lvlText w:val=" "/>
       <w:lvlJc w:val="left"/>
       <w:pPr>
-        <w:tabs>
-          <w:tab w:val="num" w:pos="4320"/>
-        </w:tabs>
-        <w:ind w:left="4800" w:hanging="480"/>
+        <w:ind w:left="5040" w:hanging="480"/>
       </w:pPr>
     </w:lvl>
     <w:lvl w:ilvl="7">
@@ -4252,10 +4496,7 @@
       <w:lvlText w:val=" "/>
       <w:lvlJc w:val="left"/>
       <w:pPr>
-        <w:tabs>
-          <w:tab w:val="num" w:pos="5040"/>
-        </w:tabs>
-        <w:ind w:left="5520" w:hanging="480"/>
+        <w:ind w:left="5760" w:hanging="480"/>
       </w:pPr>
     </w:lvl>
     <w:lvl w:ilvl="8">
@@ -4263,25 +4504,19 @@
       <w:lvlText w:val=" "/>
       <w:lvlJc w:val="left"/>
       <w:pPr>
-        <w:tabs>
-          <w:tab w:val="num" w:pos="5760"/>
-        </w:tabs>
-        <w:ind w:left="6240" w:hanging="480"/>
+        <w:ind w:left="6480" w:hanging="480"/>
       </w:pPr>
     </w:lvl>
   </w:abstractNum>
   <w:abstractNum w:abstractNumId="991">
-    <w:nsid w:val="ea454b4c"/>
+    <w:nsid w:val="A991"/>
     <w:multiLevelType w:val="multilevel"/>
     <w:lvl w:ilvl="0">
       <w:numFmt w:val="bullet"/>
       <w:lvlText w:val="•"/>
       <w:lvlJc w:val="left"/>
       <w:pPr>
-        <w:tabs>
-          <w:tab w:val="num" w:pos="0"/>
-        </w:tabs>
-        <w:ind w:left="480" w:hanging="480"/>
+        <w:ind w:left="720" w:hanging="480"/>
       </w:pPr>
     </w:lvl>
     <w:lvl w:ilvl="1">
@@ -4289,10 +4524,7 @@
       <w:lvlText w:val="–"/>
       <w:lvlJc w:val="left"/>
       <w:pPr>
-        <w:tabs>
-          <w:tab w:val="num" w:pos="720"/>
-        </w:tabs>
-        <w:ind w:left="1200" w:hanging="480"/>
+        <w:ind w:left="1440" w:hanging="480"/>
       </w:pPr>
     </w:lvl>
     <w:lvl w:ilvl="2">
@@ -4300,10 +4532,7 @@
       <w:lvlText w:val="•"/>
       <w:lvlJc w:val="left"/>
       <w:pPr>
-        <w:tabs>
-          <w:tab w:val="num" w:pos="1440"/>
-        </w:tabs>
-        <w:ind w:left="1920" w:hanging="480"/>
+        <w:ind w:left="2160" w:hanging="480"/>
       </w:pPr>
     </w:lvl>
     <w:lvl w:ilvl="3">
@@ -4311,10 +4540,7 @@
       <w:lvlText w:val="–"/>
       <w:lvlJc w:val="left"/>
       <w:pPr>
-        <w:tabs>
-          <w:tab w:val="num" w:pos="2160"/>
-        </w:tabs>
-        <w:ind w:left="2640" w:hanging="480"/>
+        <w:ind w:left="2880" w:hanging="480"/>
       </w:pPr>
     </w:lvl>
     <w:lvl w:ilvl="4">
@@ -4322,10 +4548,7 @@
       <w:lvlText w:val="•"/>
       <w:lvlJc w:val="left"/>
       <w:pPr>
-        <w:tabs>
-          <w:tab w:val="num" w:pos="2880"/>
-        </w:tabs>
-        <w:ind w:left="3360" w:hanging="480"/>
+        <w:ind w:left="3600" w:hanging="480"/>
       </w:pPr>
     </w:lvl>
     <w:lvl w:ilvl="5">
@@ -4333,10 +4556,7 @@
       <w:lvlText w:val="–"/>
       <w:lvlJc w:val="left"/>
       <w:pPr>
-        <w:tabs>
-          <w:tab w:val="num" w:pos="3600"/>
-        </w:tabs>
-        <w:ind w:left="4080" w:hanging="480"/>
+        <w:ind w:left="4320" w:hanging="480"/>
       </w:pPr>
     </w:lvl>
     <w:lvl w:ilvl="6">
@@ -4344,10 +4564,7 @@
       <w:lvlText w:val="•"/>
       <w:lvlJc w:val="left"/>
       <w:pPr>
-        <w:tabs>
-          <w:tab w:val="num" w:pos="4320"/>
-        </w:tabs>
-        <w:ind w:left="4800" w:hanging="480"/>
+        <w:ind w:left="5040" w:hanging="480"/>
       </w:pPr>
     </w:lvl>
     <w:lvl w:ilvl="7">
@@ -4355,10 +4572,7 @@
       <w:lvlText w:val="–"/>
       <w:lvlJc w:val="left"/>
       <w:pPr>
-        <w:tabs>
-          <w:tab w:val="num" w:pos="5040"/>
-        </w:tabs>
-        <w:ind w:left="5520" w:hanging="480"/>
+        <w:ind w:left="5760" w:hanging="480"/>
       </w:pPr>
     </w:lvl>
     <w:lvl w:ilvl="8">
@@ -4366,10 +4580,7 @@
       <w:lvlText w:val="•"/>
       <w:lvlJc w:val="left"/>
       <w:pPr>
-        <w:tabs>
-          <w:tab w:val="num" w:pos="5760"/>
-        </w:tabs>
-        <w:ind w:left="6240" w:hanging="480"/>
+        <w:ind w:left="6480" w:hanging="480"/>
       </w:pPr>
     </w:lvl>
   </w:abstractNum>
@@ -4426,10 +4637,10 @@
   <w:docDefaults>
     <w:rPrDefault>
       <w:rPr>
-        <w:rFonts w:asciiTheme="minorHAnsi" w:eastAsiaTheme="minorHAnsi" w:hAnsiTheme="minorHAnsi" w:cstheme="minorBidi"/>
+        <w:rFonts w:asciiTheme="minorHAnsi" w:cstheme="minorBidi" w:eastAsiaTheme="minorHAnsi" w:hAnsiTheme="minorHAnsi"/>
         <w:sz w:val="24"/>
         <w:szCs w:val="24"/>
-        <w:lang w:val="en-US" w:eastAsia="en-US" w:bidi="ar-SA"/>
+        <w:lang w:bidi="ar-SA" w:eastAsia="en-US" w:val="en-US"/>
       </w:rPr>
     </w:rPrDefault>
     <w:pPrDefault>
@@ -4438,35 +4649,35 @@
       </w:pPr>
     </w:pPrDefault>
   </w:docDefaults>
-  <w:latentStyles w:defLockedState="0" w:defUIPriority="0" w:defSemiHidden="0" w:defUnhideWhenUsed="0" w:defQFormat="0" w:count="276"/>
-  <w:style w:type="paragraph" w:default="1" w:styleId="Normal">
+  <w:latentStyles w:count="276" w:defLockedState="0" w:defQFormat="0" w:defSemiHidden="0" w:defUIPriority="0" w:defUnhideWhenUsed="0"/>
+  <w:style w:default="1" w:styleId="Normal" w:type="paragraph">
     <w:name w:val="Normal"/>
     <w:qFormat/>
   </w:style>
-  <w:style w:type="paragraph" w:styleId="BodyText">
+  <w:style w:styleId="BodyText" w:type="paragraph">
     <w:name w:val="Body Text"/>
     <w:basedOn w:val="Normal"/>
     <w:link w:val="BodyTextChar"/>
     <w:pPr>
-      <w:spacing w:before="180" w:after="180"/>
+      <w:spacing w:after="180" w:before="180"/>
     </w:pPr>
     <w:qFormat/>
   </w:style>
-  <w:style w:type="paragraph" w:customStyle="1" w:styleId="FirstParagraph">
+  <w:style w:customStyle="1" w:styleId="FirstParagraph" w:type="paragraph">
     <w:name w:val="First Paragraph"/>
     <w:basedOn w:val="BodyText"/>
     <w:next w:val="BodyText"/>
     <w:qFormat/>
   </w:style>
-  <w:style w:type="paragraph" w:customStyle="1" w:styleId="Compact">
+  <w:style w:customStyle="1" w:styleId="Compact" w:type="paragraph">
     <w:name w:val="Compact"/>
     <w:basedOn w:val="BodyText"/>
     <w:qFormat/>
     <w:pPr>
-      <w:spacing w:before="36" w:after="36"/>
+      <w:spacing w:after="36" w:before="36"/>
     </w:pPr>
   </w:style>
-  <w:style w:type="paragraph" w:styleId="Title">
+  <w:style w:styleId="Title" w:type="paragraph">
     <w:name w:val="Title"/>
     <w:basedOn w:val="Normal"/>
     <w:next w:val="BodyText"/>
@@ -4474,19 +4685,19 @@
     <w:pPr>
       <w:keepNext/>
       <w:keepLines/>
-      <w:spacing w:before="480" w:after="240"/>
+      <w:spacing w:after="240" w:before="480"/>
       <w:jc w:val="center"/>
     </w:pPr>
     <w:rPr>
-      <w:rFonts w:asciiTheme="majorHAnsi" w:eastAsiaTheme="majorEastAsia" w:hAnsiTheme="majorHAnsi" w:cstheme="majorBidi"/>
+      <w:rFonts w:asciiTheme="majorHAnsi" w:cstheme="majorBidi" w:eastAsiaTheme="majorEastAsia" w:hAnsiTheme="majorHAnsi"/>
       <w:b/>
       <w:bCs/>
-      <w:color w:val="345A8A" w:themeColor="accent1" w:themeShade="B5"/>
+      <w:color w:themeColor="accent1" w:themeShade="B5" w:val="345A8A"/>
       <w:sz w:val="36"/>
       <w:szCs w:val="36"/>
     </w:rPr>
   </w:style>
-  <w:style w:type="paragraph" w:styleId="Subtitle">
+  <w:style w:styleId="Subtitle" w:type="paragraph">
     <w:name w:val="Subtitle"/>
     <w:basedOn w:val="Title"/>
     <w:next w:val="BodyText"/>
@@ -4494,7 +4705,7 @@
     <w:pPr>
       <w:keepNext/>
       <w:keepLines/>
-      <w:spacing w:before="240" w:after="240"/>
+      <w:spacing w:after="240" w:before="240"/>
       <w:jc w:val="center"/>
     </w:pPr>
     <w:rPr>
@@ -4502,7 +4713,7 @@
       <w:szCs w:val="30"/>
     </w:rPr>
   </w:style>
-  <w:style w:type="paragraph" w:customStyle="1" w:styleId="Author">
+  <w:style w:customStyle="1" w:styleId="Author" w:type="paragraph">
     <w:name w:val="Author"/>
     <w:next w:val="BodyText"/>
     <w:qFormat/>
@@ -4512,7 +4723,7 @@
       <w:jc w:val="center"/>
     </w:pPr>
   </w:style>
-  <w:style w:type="paragraph" w:styleId="Date">
+  <w:style w:styleId="Date" w:type="paragraph">
     <w:name w:val="Date"/>
     <w:next w:val="BodyText"/>
     <w:qFormat/>
@@ -4522,7 +4733,26 @@
       <w:jc w:val="center"/>
     </w:pPr>
   </w:style>
-  <w:style w:type="paragraph" w:customStyle="1" w:styleId="Abstract">
+  <w:style w:customStyle="1" w:styleId="AbstractTitle" w:type="paragraph">
+    <w:name w:val="Abstract Title"/>
+    <w:basedOn w:val="Normal"/>
+    <w:next w:val="Abstract"/>
+    <w:qFormat/>
+    <w:pPr>
+      <w:keepNext/>
+      <w:keepLines/>
+      <w:jc w:val="center"/>
+      <w:spacing w:after="0" w:before="300"/>
+    </w:pPr>
+    <w:rPr>
+      <w:sz w:val="20"/>
+      <w:szCs w:val="20"/>
+      <w:b/>
+      <w:color w:val="345A8A"/>
+      &gt;
+    </w:rPr>
+  </w:style>
+  <w:style w:customStyle="1" w:styleId="Abstract" w:type="paragraph">
     <w:name w:val="Abstract"/>
     <w:basedOn w:val="Normal"/>
     <w:next w:val="BodyText"/>
@@ -4530,14 +4760,14 @@
     <w:pPr>
       <w:keepNext/>
       <w:keepLines/>
-      <w:spacing w:before="300" w:after="300"/>
+      <w:spacing w:after="300" w:before="100"/>
     </w:pPr>
     <w:rPr>
       <w:sz w:val="20"/>
       <w:szCs w:val="20"/>
     </w:rPr>
   </w:style>
-  <w:style w:type="paragraph" w:styleId="Bibliography">
+  <w:style w:styleId="Bibliography" w:type="paragraph">
     <w:name w:val="Bibliography"/>
     <w:basedOn w:val="Normal"/>
     <w:next w:val="Bibliography"/>
@@ -4545,7 +4775,7 @@
     <w:pPr/>
     <w:rPr/>
   </w:style>
-  <w:style w:type="paragraph" w:styleId="Heading1">
+  <w:style w:styleId="Heading1" w:type="paragraph">
     <w:name w:val="Heading 1"/>
     <w:basedOn w:val="Normal"/>
     <w:next w:val="BodyText"/>
@@ -4554,19 +4784,19 @@
     <w:pPr>
       <w:keepNext/>
       <w:keepLines/>
-      <w:spacing w:before="480" w:after="0"/>
+      <w:spacing w:after="0" w:before="480"/>
       <w:outlineLvl w:val="0"/>
     </w:pPr>
     <w:rPr>
-      <w:rFonts w:asciiTheme="majorHAnsi" w:eastAsiaTheme="majorEastAsia" w:hAnsiTheme="majorHAnsi" w:cstheme="majorBidi"/>
+      <w:rFonts w:asciiTheme="majorHAnsi" w:cstheme="majorBidi" w:eastAsiaTheme="majorEastAsia" w:hAnsiTheme="majorHAnsi"/>
       <w:b/>
       <w:bCs/>
-      <w:color w:val="4F81BD" w:themeColor="accent1"/>
+      <w:color w:themeColor="accent1" w:val="4F81BD"/>
       <w:sz w:val="32"/>
       <w:szCs w:val="32"/>
     </w:rPr>
   </w:style>
-  <w:style w:type="paragraph" w:styleId="Heading2">
+  <w:style w:styleId="Heading2" w:type="paragraph">
     <w:name w:val="Heading 2"/>
     <w:basedOn w:val="Normal"/>
     <w:next w:val="BodyText"/>
@@ -4576,19 +4806,19 @@
     <w:pPr>
       <w:keepNext/>
       <w:keepLines/>
-      <w:spacing w:before="200" w:after="0"/>
+      <w:spacing w:after="0" w:before="200"/>
       <w:outlineLvl w:val="1"/>
     </w:pPr>
     <w:rPr>
-      <w:rFonts w:asciiTheme="majorHAnsi" w:eastAsiaTheme="majorEastAsia" w:hAnsiTheme="majorHAnsi" w:cstheme="majorBidi"/>
+      <w:rFonts w:asciiTheme="majorHAnsi" w:cstheme="majorBidi" w:eastAsiaTheme="majorEastAsia" w:hAnsiTheme="majorHAnsi"/>
       <w:b/>
       <w:bCs/>
-      <w:color w:val="4F81BD" w:themeColor="accent1"/>
+      <w:color w:themeColor="accent1" w:val="4F81BD"/>
       <w:sz w:val="28"/>
       <w:szCs w:val="28"/>
     </w:rPr>
   </w:style>
-  <w:style w:type="paragraph" w:styleId="Heading3">
+  <w:style w:styleId="Heading3" w:type="paragraph">
     <w:name w:val="Heading 3"/>
     <w:basedOn w:val="Normal"/>
     <w:next w:val="BodyText"/>
@@ -4598,19 +4828,19 @@
     <w:pPr>
       <w:keepNext/>
       <w:keepLines/>
-      <w:spacing w:before="200" w:after="0"/>
+      <w:spacing w:after="0" w:before="200"/>
       <w:outlineLvl w:val="2"/>
     </w:pPr>
     <w:rPr>
-      <w:rFonts w:asciiTheme="majorHAnsi" w:eastAsiaTheme="majorEastAsia" w:hAnsiTheme="majorHAnsi" w:cstheme="majorBidi"/>
+      <w:rFonts w:asciiTheme="majorHAnsi" w:cstheme="majorBidi" w:eastAsiaTheme="majorEastAsia" w:hAnsiTheme="majorHAnsi"/>
       <w:b/>
       <w:bCs/>
-      <w:color w:val="4F81BD" w:themeColor="accent1"/>
+      <w:color w:themeColor="accent1" w:val="4F81BD"/>
       <w:sz w:val="24"/>
       <w:szCs w:val="24"/>
     </w:rPr>
   </w:style>
-  <w:style w:type="paragraph" w:styleId="Heading4">
+  <w:style w:styleId="Heading4" w:type="paragraph">
     <w:name w:val="Heading 4"/>
     <w:basedOn w:val="Normal"/>
     <w:next w:val="BodyText"/>
@@ -4620,19 +4850,19 @@
     <w:pPr>
       <w:keepNext/>
       <w:keepLines/>
-      <w:spacing w:before="200" w:after="0"/>
+      <w:spacing w:after="0" w:before="200"/>
       <w:outlineLvl w:val="3"/>
     </w:pPr>
     <w:rPr>
-      <w:rFonts w:asciiTheme="majorHAnsi" w:eastAsiaTheme="majorEastAsia" w:hAnsiTheme="majorHAnsi" w:cstheme="majorBidi"/>
+      <w:rFonts w:asciiTheme="majorHAnsi" w:cstheme="majorBidi" w:eastAsiaTheme="majorEastAsia" w:hAnsiTheme="majorHAnsi"/>
       <w:i/>
       <w:bCs/>
-      <w:color w:val="4F81BD" w:themeColor="accent1"/>
+      <w:color w:themeColor="accent1" w:val="4F81BD"/>
       <w:sz w:val="24"/>
       <w:szCs w:val="24"/>
     </w:rPr>
   </w:style>
-  <w:style w:type="paragraph" w:styleId="Heading5">
+  <w:style w:styleId="Heading5" w:type="paragraph">
     <w:name w:val="Heading 5"/>
     <w:basedOn w:val="Normal"/>
     <w:next w:val="BodyText"/>
@@ -4642,18 +4872,18 @@
     <w:pPr>
       <w:keepNext/>
       <w:keepLines/>
-      <w:spacing w:before="200" w:after="0"/>
+      <w:spacing w:after="0" w:before="200"/>
       <w:outlineLvl w:val="4"/>
     </w:pPr>
     <w:rPr>
-      <w:rFonts w:asciiTheme="majorHAnsi" w:eastAsiaTheme="majorEastAsia" w:hAnsiTheme="majorHAnsi" w:cstheme="majorBidi"/>
+      <w:rFonts w:asciiTheme="majorHAnsi" w:cstheme="majorBidi" w:eastAsiaTheme="majorEastAsia" w:hAnsiTheme="majorHAnsi"/>
       <w:iCs/>
-      <w:color w:val="4F81BD" w:themeColor="accent1"/>
+      <w:color w:themeColor="accent1" w:val="4F81BD"/>
       <w:sz w:val="24"/>
       <w:szCs w:val="24"/>
     </w:rPr>
   </w:style>
-  <w:style w:type="paragraph" w:styleId="Heading6">
+  <w:style w:styleId="Heading6" w:type="paragraph">
     <w:name w:val="Heading 6"/>
     <w:basedOn w:val="Normal"/>
     <w:next w:val="BodyText"/>
@@ -4663,17 +4893,17 @@
     <w:pPr>
       <w:keepNext/>
       <w:keepLines/>
-      <w:spacing w:before="200" w:after="0"/>
+      <w:spacing w:after="0" w:before="200"/>
       <w:outlineLvl w:val="5"/>
     </w:pPr>
     <w:rPr>
-      <w:rFonts w:asciiTheme="majorHAnsi" w:eastAsiaTheme="majorEastAsia" w:hAnsiTheme="majorHAnsi" w:cstheme="majorBidi"/>
-      <w:color w:val="4F81BD" w:themeColor="accent1"/>
+      <w:rFonts w:asciiTheme="majorHAnsi" w:cstheme="majorBidi" w:eastAsiaTheme="majorEastAsia" w:hAnsiTheme="majorHAnsi"/>
+      <w:color w:themeColor="accent1" w:val="4F81BD"/>
       <w:sz w:val="24"/>
       <w:szCs w:val="24"/>
     </w:rPr>
   </w:style>
-  <w:style w:type="paragraph" w:styleId="Heading7">
+  <w:style w:styleId="Heading7" w:type="paragraph">
     <w:name w:val="Heading 7"/>
     <w:basedOn w:val="Normal"/>
     <w:next w:val="BodyText"/>
@@ -4683,17 +4913,17 @@
     <w:pPr>
       <w:keepNext/>
       <w:keepLines/>
-      <w:spacing w:before="200" w:after="0"/>
+      <w:spacing w:after="0" w:before="200"/>
       <w:outlineLvl w:val="6"/>
     </w:pPr>
     <w:rPr>
-      <w:rFonts w:asciiTheme="majorHAnsi" w:eastAsiaTheme="majorEastAsia" w:hAnsiTheme="majorHAnsi" w:cstheme="majorBidi"/>
-      <w:color w:val="4F81BD" w:themeColor="accent1"/>
+      <w:rFonts w:asciiTheme="majorHAnsi" w:cstheme="majorBidi" w:eastAsiaTheme="majorEastAsia" w:hAnsiTheme="majorHAnsi"/>
+      <w:color w:themeColor="accent1" w:val="4F81BD"/>
       <w:sz w:val="24"/>
       <w:szCs w:val="24"/>
     </w:rPr>
   </w:style>
-  <w:style w:type="paragraph" w:styleId="Heading8">
+  <w:style w:styleId="Heading8" w:type="paragraph">
     <w:name w:val="Heading 8"/>
     <w:basedOn w:val="Normal"/>
     <w:next w:val="BodyText"/>
@@ -4703,17 +4933,17 @@
     <w:pPr>
       <w:keepNext/>
       <w:keepLines/>
-      <w:spacing w:before="200" w:after="0"/>
+      <w:spacing w:after="0" w:before="200"/>
       <w:outlineLvl w:val="7"/>
     </w:pPr>
     <w:rPr>
-      <w:rFonts w:asciiTheme="majorHAnsi" w:eastAsiaTheme="majorEastAsia" w:hAnsiTheme="majorHAnsi" w:cstheme="majorBidi"/>
-      <w:color w:val="4F81BD" w:themeColor="accent1"/>
+      <w:rFonts w:asciiTheme="majorHAnsi" w:cstheme="majorBidi" w:eastAsiaTheme="majorEastAsia" w:hAnsiTheme="majorHAnsi"/>
+      <w:color w:themeColor="accent1" w:val="4F81BD"/>
       <w:sz w:val="24"/>
       <w:szCs w:val="24"/>
     </w:rPr>
   </w:style>
-  <w:style w:type="paragraph" w:styleId="Heading9">
+  <w:style w:styleId="Heading9" w:type="paragraph">
     <w:name w:val="Heading 9"/>
     <w:basedOn w:val="Normal"/>
     <w:next w:val="BodyText"/>
@@ -4723,17 +4953,17 @@
     <w:pPr>
       <w:keepNext/>
       <w:keepLines/>
-      <w:spacing w:before="200" w:after="0"/>
+      <w:spacing w:after="0" w:before="200"/>
       <w:outlineLvl w:val="8"/>
     </w:pPr>
     <w:rPr>
-      <w:rFonts w:asciiTheme="majorHAnsi" w:eastAsiaTheme="majorEastAsia" w:hAnsiTheme="majorHAnsi" w:cstheme="majorBidi"/>
-      <w:color w:val="4F81BD" w:themeColor="accent1"/>
+      <w:rFonts w:asciiTheme="majorHAnsi" w:cstheme="majorBidi" w:eastAsiaTheme="majorEastAsia" w:hAnsiTheme="majorHAnsi"/>
+      <w:color w:themeColor="accent1" w:val="4F81BD"/>
       <w:sz w:val="24"/>
       <w:szCs w:val="24"/>
     </w:rPr>
   </w:style>
-  <w:style w:type="paragraph" w:styleId="BlockText">
+  <w:style w:styleId="BlockText" w:type="paragraph">
     <w:name w:val="Block Text"/>
     <w:basedOn w:val="BodyText"/>
     <w:next w:val="BodyText"/>
@@ -4741,11 +4971,11 @@
     <w:unhideWhenUsed/>
     <w:qFormat/>
     <w:pPr>
-      <w:spacing w:before="100" w:after="100"/>
+      <w:spacing w:after="100" w:before="100"/>
       <w:ind w:firstLine="0" w:left="480" w:right="480"/>
     </w:pPr>
   </w:style>
-  <w:style w:type="paragraph" w:styleId="FootnoteText">
+  <w:style w:styleId="FootnoteText" w:type="paragraph">
     <w:name w:val="Footnote Text"/>
     <w:basedOn w:val="Normal"/>
     <w:next w:val="FootnoteText"/>
@@ -4753,28 +4983,43 @@
     <w:unhideWhenUsed/>
     <w:qFormat/>
   </w:style>
-  <w:style w:type="character" w:default="1" w:styleId="DefaultParagraphFont">
+  <w:style w:default="1" w:styleId="DefaultParagraphFont" w:type="character">
     <w:name w:val="Default Paragraph Font"/>
     <w:semiHidden/>
     <w:unhideWhenUsed/>
   </w:style>
-  <w:style w:type="table" w:default="1" w:styleId="Table">
+  <w:style w:default="1" w:styleId="Table" w:type="table">
     <w:name w:val="Table"/>
     <w:basedOn w:val="TableNormal"/>
     <w:semiHidden/>
     <w:unhideWhenUsed/>
     <w:qFormat/>
     <w:tblPr>
-      <w:tblInd w:w="0" w:type="dxa"/>
+      <w:tblInd w:type="dxa" w:w="0"/>
       <w:tblCellMar>
-        <w:top w:w="0" w:type="dxa"/>
-        <w:left w:w="108" w:type="dxa"/>
-        <w:bottom w:w="0" w:type="dxa"/>
-        <w:right w:w="108" w:type="dxa"/>
+        <w:top w:type="dxa" w:w="0"/>
+        <w:left w:type="dxa" w:w="108"/>
+        <w:bottom w:type="dxa" w:w="0"/>
+        <w:right w:type="dxa" w:w="108"/>
       </w:tblCellMar>
     </w:tblPr>
-  </w:style>
-  <w:style w:type="paragraph" w:customStyle="1" w:styleId="DefinitionTerm">
+    <w:tblStylePr w:type="firstRow">
+      <w:tblPr>
+        <w:jc w:val="left"/>
+        <w:tblInd w:type="dxa" w:w="0"/>
+      </w:tblPr>
+      <w:trPr>
+        <w:jc w:val="left"/>
+      </w:trPr>
+      <w:tcPr>
+        <w:vAlign w:val="bottom"/>
+        <w:tcBorders>
+          <w:bottom w:val="single"/>
+        </w:tcBorders>
+      </w:tcPr>
+    </w:tblStylePr>
+  </w:style>
+  <w:style w:customStyle="1" w:styleId="DefinitionTerm" w:type="paragraph">
     <w:name w:val="Definition Term"/>
     <w:basedOn w:val="Normal"/>
     <w:next w:val="Definition"/>
@@ -4787,49 +5032,49 @@
       <w:b/>
     </w:rPr>
   </w:style>
-  <w:style w:type="paragraph" w:customStyle="1" w:styleId="Definition">
+  <w:style w:customStyle="1" w:styleId="Definition" w:type="paragraph">
     <w:name w:val="Definition"/>
     <w:basedOn w:val="Normal"/>
   </w:style>
-  <w:style w:type="paragraph" w:styleId="Caption">
+  <w:style w:styleId="Caption" w:type="paragraph">
     <w:name w:val="Caption"/>
     <w:basedOn w:val="Normal"/>
     <w:link w:val="BodyTextChar"/>
     <w:pPr>
-      <w:spacing w:before="0" w:after="120"/>
+      <w:spacing w:after="120" w:before="0"/>
     </w:pPr>
     <w:rPr>
       <w:i/>
     </w:rPr>
   </w:style>
-  <w:style w:type="paragraph" w:customStyle="1" w:styleId="TableCaption">
+  <w:style w:customStyle="1" w:styleId="TableCaption" w:type="paragraph">
     <w:name w:val="Table Caption"/>
     <w:basedOn w:val="Caption"/>
     <w:pPr>
       <w:keepNext/>
     </w:pPr>
   </w:style>
-  <w:style w:type="paragraph" w:customStyle="1" w:styleId="ImageCaption">
+  <w:style w:customStyle="1" w:styleId="ImageCaption" w:type="paragraph">
     <w:name w:val="Image Caption"/>
     <w:basedOn w:val="Caption"/>
   </w:style>
-  <w:style w:type="paragraph" w:customStyle="1" w:styleId="Figure">
+  <w:style w:customStyle="1" w:styleId="Figure" w:type="paragraph">
     <w:name w:val="Figure"/>
     <w:basedOn w:val="Normal"/>
   </w:style>
-  <w:style w:type="paragraph" w:customStyle="1" w:styleId="CaptionedFigure">
+  <w:style w:customStyle="1" w:styleId="CaptionedFigure" w:type="paragraph">
     <w:name w:val="Captioned Figure"/>
     <w:basedOn w:val="Figure"/>
     <w:pPr>
       <w:keepNext/>
     </w:pPr>
   </w:style>
-  <w:style w:type="character" w:customStyle="1" w:styleId="BodyTextChar">
+  <w:style w:customStyle="1" w:styleId="BodyTextChar" w:type="character">
     <w:name w:val="Body Text Char"/>
     <w:basedOn w:val="DefaultParagraphFont"/>
     <w:link w:val="BodyText"/>
   </w:style>
-  <w:style w:type="character" w:customStyle="1" w:styleId="VerbatimChar">
+  <w:style w:customStyle="1" w:styleId="VerbatimChar" w:type="character">
     <w:name w:val="Verbatim Char"/>
     <w:basedOn w:val="BodyTextChar"/>
     <w:rPr>
@@ -4837,21 +5082,25 @@
       <w:sz w:val="22"/>
     </w:rPr>
   </w:style>
-  <w:style w:type="character" w:styleId="FootnoteReference">
+  <w:style w:customStyle="1" w:styleId="SectionNumber" w:type="character">
+    <w:name w:val="Section Number"/>
+    <w:basedOn w:val="BodyTextChar"/>
+  </w:style>
+  <w:style w:styleId="FootnoteReference" w:type="character">
     <w:name w:val="Footnote Reference"/>
     <w:basedOn w:val="BodyTextChar"/>
     <w:rPr>
       <w:vertAlign w:val="superscript"/>
     </w:rPr>
   </w:style>
-  <w:style w:type="character" w:styleId="Hyperlink">
+  <w:style w:styleId="Hyperlink" w:type="character">
     <w:name w:val="Hyperlink"/>
     <w:basedOn w:val="BodyTextChar"/>
     <w:rPr>
-      <w:color w:val="4F81BD" w:themeColor="accent1"/>
+      <w:color w:themeColor="accent1" w:val="4F81BD"/>
     </w:rPr>
   </w:style>
-  <w:style w:type="paragraph" w:styleId="TOCHeading">
+  <w:style w:styleId="TOCHeading" w:type="paragraph">
     <w:name w:val="TOC Heading"/>
     <w:basedOn w:val="Heading1"/>
     <w:next w:val="BodyText"/>
@@ -4863,10 +5112,10 @@
       <w:outlineLvl w:val="9"/>
     </w:pPr>
     <w:rPr>
-      <w:rFonts w:asciiTheme="majorHAnsi" w:eastAsiaTheme="majorEastAsia" w:hAnsiTheme="majorHAnsi" w:cstheme="majorBidi"/>
+      <w:rFonts w:asciiTheme="majorHAnsi" w:cstheme="majorBidi" w:eastAsiaTheme="majorEastAsia" w:hAnsiTheme="majorHAnsi"/>
       <w:b w:val="0"/>
       <w:bCs w:val="0"/>
-      <w:color w:val="365F91" w:themeColor="accent1" w:themeShade="BF"/>
+      <w:color w:themeColor="accent1" w:themeShade="BF" w:val="365F91"/>
     </w:rPr>
   </w:style>
   <w:style w:type="paragraph" w:customStyle="1" w:styleId="SourceCode">
@@ -4958,7 +5207,10 @@
   <w:style w:type="character" w:customStyle="1" w:styleId="ImportTok">
     <w:name w:val="ImportTok"/>
     <w:basedOn w:val="VerbatimChar"/>
-    <w:rPr/>
+    <w:rPr>
+      <w:color w:val="008000"/>
+      <w:b/>
+    </w:rPr>
   </w:style>
   <w:style w:type="character" w:customStyle="1" w:styleId="CommentTok">
     <w:name w:val="CommentTok"/>
@@ -5033,7 +5285,9 @@
   <w:style w:type="character" w:customStyle="1" w:styleId="BuiltInTok">
     <w:name w:val="BuiltInTok"/>
     <w:basedOn w:val="VerbatimChar"/>
-    <w:rPr/>
+    <w:rPr>
+      <w:color w:val="008000"/>
+    </w:rPr>
   </w:style>
   <w:style w:type="character" w:customStyle="1" w:styleId="ExtensionTok">
     <w:name w:val="ExtensionTok"/>

</xml_diff>